<commit_message>
Fix DOCX key-word bold rendering in Psychotherapy Unit II notes
</commit_message>
<xml_diff>
--- a/Psychotherapy_Unit_II_Comprehensive_Notes.docx
+++ b/Psychotherapy_Unit_II_Comprehensive_Notes.docx
@@ -359,7 +359,16 @@
         <w:pStyle w:val="ListBullet"/>
       </w:pPr>
       <w:r>
-        <w:t>Words in **bold** are the memory hooks: skim the bold words first to recall the gist of a sentence, then read the full sentence to fill in the detail.</w:t>
+        <w:t xml:space="preserve">Words in </w:t>
+      </w:r>
+      <w:r>
+        <w:rPr>
+          <w:b/>
+        </w:rPr>
+        <w:t>bold</w:t>
+      </w:r>
+      <w:r>
+        <w:t xml:space="preserve"> are the memory hooks: skim the bold words first to recall the gist of a sentence, then read the full sentence to fill in the detail.</w:t>
       </w:r>
     </w:p>
     <w:p>
@@ -449,7 +458,16 @@
               <w:t xml:space="preserve">Guideline: </w:t>
             </w:r>
             <w:r>
-              <w:t xml:space="preserve"> The **APA Dictionary of Psychology** characterises the </w:t>
+              <w:t xml:space="preserve"> The </w:t>
+            </w:r>
+            <w:r>
+              <w:rPr>
+                <w:b/>
+              </w:rPr>
+              <w:t>APA Dictionary of Psychology</w:t>
+            </w:r>
+            <w:r>
+              <w:t xml:space="preserve"> characterises the </w:t>
             </w:r>
             <w:r>
               <w:t xml:space="preserve">therapeutic alliance </w:t>
@@ -461,7 +479,43 @@
               <w:t>(the cooperative working relationship between client and therapist)</w:t>
             </w:r>
             <w:r>
-              <w:t xml:space="preserve"> as the **cooperative working relationship**, seen as **essential** for progress, that combines the client's affective **bond** with the therapist and their agreement on the **goals and tasks** of treatment. </w:t>
+              <w:t xml:space="preserve"> as the </w:t>
+            </w:r>
+            <w:r>
+              <w:rPr>
+                <w:b/>
+              </w:rPr>
+              <w:t>cooperative working relationship</w:t>
+            </w:r>
+            <w:r>
+              <w:t xml:space="preserve">, seen as </w:t>
+            </w:r>
+            <w:r>
+              <w:rPr>
+                <w:b/>
+              </w:rPr>
+              <w:t>essential</w:t>
+            </w:r>
+            <w:r>
+              <w:t xml:space="preserve"> for progress, that combines the client's affective </w:t>
+            </w:r>
+            <w:r>
+              <w:rPr>
+                <w:b/>
+              </w:rPr>
+              <w:t>bond</w:t>
+            </w:r>
+            <w:r>
+              <w:t xml:space="preserve"> with the therapist and their agreement on the </w:t>
+            </w:r>
+            <w:r>
+              <w:rPr>
+                <w:b/>
+              </w:rPr>
+              <w:t>goals and tasks</w:t>
+            </w:r>
+            <w:r>
+              <w:t xml:space="preserve"> of treatment. </w:t>
             </w:r>
             <w:r>
               <w:rPr>
@@ -482,7 +536,34 @@
               <w:t xml:space="preserve">Guideline: </w:t>
             </w:r>
             <w:r>
-              <w:t xml:space="preserve"> The **World Health Organization**, in its mhGAP and psychological-interventions guidance, characterises effective care as being delivered within a **respectful, trusting and collaborative** provider-client relationship, which it treats as a **foundation** for engagement and adherence rather than an optional extra. </w:t>
+              <w:t xml:space="preserve"> The </w:t>
+            </w:r>
+            <w:r>
+              <w:rPr>
+                <w:b/>
+              </w:rPr>
+              <w:t>World Health Organization</w:t>
+            </w:r>
+            <w:r>
+              <w:t xml:space="preserve">, in its mhGAP and psychological-interventions guidance, characterises effective care as being delivered within a </w:t>
+            </w:r>
+            <w:r>
+              <w:rPr>
+                <w:b/>
+              </w:rPr>
+              <w:t>respectful, trusting and collaborative</w:t>
+            </w:r>
+            <w:r>
+              <w:t xml:space="preserve"> provider-client relationship, which it treats as a </w:t>
+            </w:r>
+            <w:r>
+              <w:rPr>
+                <w:b/>
+              </w:rPr>
+              <w:t>foundation</w:t>
+            </w:r>
+            <w:r>
+              <w:t xml:space="preserve"> for engagement and adherence rather than an optional extra. </w:t>
             </w:r>
             <w:r>
               <w:rPr>
@@ -503,7 +584,34 @@
               <w:t xml:space="preserve">Theoretical view: </w:t>
             </w:r>
             <w:r>
-              <w:t xml:space="preserve"> **Gabbard** describes the therapeutic alliance as a **fundamental concept** that applies across all forms of psychotherapy, denoting the **collaborative bond** that lets client and therapist work together toward shared aims. </w:t>
+              <w:t xml:space="preserve"> </w:t>
+            </w:r>
+            <w:r>
+              <w:rPr>
+                <w:b/>
+              </w:rPr>
+              <w:t>Gabbard</w:t>
+            </w:r>
+            <w:r>
+              <w:t xml:space="preserve"> describes the therapeutic alliance as a </w:t>
+            </w:r>
+            <w:r>
+              <w:rPr>
+                <w:b/>
+              </w:rPr>
+              <w:t>fundamental concept</w:t>
+            </w:r>
+            <w:r>
+              <w:t xml:space="preserve"> that applies across all forms of psychotherapy, denoting the </w:t>
+            </w:r>
+            <w:r>
+              <w:rPr>
+                <w:b/>
+              </w:rPr>
+              <w:t>collaborative bond</w:t>
+            </w:r>
+            <w:r>
+              <w:t xml:space="preserve"> that lets client and therapist work together toward shared aims. </w:t>
             </w:r>
             <w:r>
               <w:rPr>
@@ -524,7 +632,34 @@
               <w:t xml:space="preserve">Theoretical view: </w:t>
             </w:r>
             <w:r>
-              <w:t xml:space="preserve"> **Greenson (1967)**, reported in Corsini and Wedding, framed the **working alliance** as the **rational, non-neurotic** partnership in which the client aligns with the therapist's method to pursue the work of therapy. </w:t>
+              <w:t xml:space="preserve"> </w:t>
+            </w:r>
+            <w:r>
+              <w:rPr>
+                <w:b/>
+              </w:rPr>
+              <w:t>Greenson (1967)</w:t>
+            </w:r>
+            <w:r>
+              <w:t xml:space="preserve">, reported in Corsini and Wedding, framed the </w:t>
+            </w:r>
+            <w:r>
+              <w:rPr>
+                <w:b/>
+              </w:rPr>
+              <w:t>working alliance</w:t>
+            </w:r>
+            <w:r>
+              <w:t xml:space="preserve"> as the </w:t>
+            </w:r>
+            <w:r>
+              <w:rPr>
+                <w:b/>
+              </w:rPr>
+              <w:t>rational, non-neurotic</w:t>
+            </w:r>
+            <w:r>
+              <w:t xml:space="preserve"> partnership in which the client aligns with the therapist's method to pursue the work of therapy. </w:t>
             </w:r>
             <w:r>
               <w:rPr>
@@ -563,7 +698,16 @@
         <w:t>(the carrier through which specific methods take effect)</w:t>
       </w:r>
       <w:r>
-        <w:t xml:space="preserve"> of therapy, meaning that **techniques work through the relationship**, so even an excellent method fails when the bond with the client is weak. </w:t>
+        <w:t xml:space="preserve"> of therapy, meaning that </w:t>
+      </w:r>
+      <w:r>
+        <w:rPr>
+          <w:b/>
+        </w:rPr>
+        <w:t>techniques work through the relationship</w:t>
+      </w:r>
+      <w:r>
+        <w:t xml:space="preserve">, so even an excellent method fails when the bond with the client is weak. </w:t>
       </w:r>
       <w:r>
         <w:rPr>
@@ -584,7 +728,25 @@
         <w:t xml:space="preserve">Theoretical view: </w:t>
       </w:r>
       <w:r>
-        <w:t xml:space="preserve"> **Rogers (1957)** argued that the relationship conditions of empathy, warmth and genuineness are **necessary and sufficient** for change, so that for him the relationship itself is the active ingredient rather than a mere background. </w:t>
+        <w:t xml:space="preserve"> </w:t>
+      </w:r>
+      <w:r>
+        <w:rPr>
+          <w:b/>
+        </w:rPr>
+        <w:t>Rogers (1957)</w:t>
+      </w:r>
+      <w:r>
+        <w:t xml:space="preserve"> argued that the relationship conditions of empathy, warmth and genuineness are </w:t>
+      </w:r>
+      <w:r>
+        <w:rPr>
+          <w:b/>
+        </w:rPr>
+        <w:t>necessary and sufficient</w:t>
+      </w:r>
+      <w:r>
+        <w:t xml:space="preserve"> for change, so that for him the relationship itself is the active ingredient rather than a mere background. </w:t>
       </w:r>
       <w:r>
         <w:rPr>
@@ -605,7 +767,25 @@
         <w:t xml:space="preserve">Theoretical view: </w:t>
       </w:r>
       <w:r>
-        <w:t xml:space="preserve"> Many later clinicians, especially **behaviour therapists**, regard those relationship conditions as **necessary but not sufficient**, holding that a good bond is required yet must be paired with specific techniques to produce change. </w:t>
+        <w:t xml:space="preserve"> Many later clinicians, especially </w:t>
+      </w:r>
+      <w:r>
+        <w:rPr>
+          <w:b/>
+        </w:rPr>
+        <w:t>behaviour therapists</w:t>
+      </w:r>
+      <w:r>
+        <w:t xml:space="preserve">, regard those relationship conditions as </w:t>
+      </w:r>
+      <w:r>
+        <w:rPr>
+          <w:b/>
+        </w:rPr>
+        <w:t>necessary but not sufficient</w:t>
+      </w:r>
+      <w:r>
+        <w:t xml:space="preserve">, holding that a good bond is required yet must be paired with specific techniques to produce change. </w:t>
       </w:r>
       <w:r>
         <w:rPr>
@@ -620,7 +800,16 @@
         <w:pStyle w:val="ListBullet"/>
       </w:pPr>
       <w:r>
-        <w:t xml:space="preserve">The alliance is a **pantheoretical common factor**, which means it cuts across psychodynamic, cognitive-behavioural, humanistic and systemic schools instead of belonging to any single model. </w:t>
+        <w:t xml:space="preserve">The alliance is a </w:t>
+      </w:r>
+      <w:r>
+        <w:rPr>
+          <w:b/>
+        </w:rPr>
+        <w:t>pantheoretical common factor</w:t>
+      </w:r>
+      <w:r>
+        <w:t xml:space="preserve">, which means it cuts across psychodynamic, cognitive-behavioural, humanistic and systemic schools instead of belonging to any single model. </w:t>
       </w:r>
       <w:r>
         <w:rPr>
@@ -635,7 +824,16 @@
         <w:pStyle w:val="ListBullet"/>
       </w:pPr>
       <w:r>
-        <w:t xml:space="preserve">A strong early bond helps the anxious or reluctant client feel **safe enough to disclose**, so trust is the precondition that lets assessment, formulation and intervention actually proceed. </w:t>
+        <w:t xml:space="preserve">A strong early bond helps the anxious or reluctant client feel </w:t>
+      </w:r>
+      <w:r>
+        <w:rPr>
+          <w:b/>
+        </w:rPr>
+        <w:t>safe enough to disclose</w:t>
+      </w:r>
+      <w:r>
+        <w:t xml:space="preserve">, so trust is the precondition that lets assessment, formulation and intervention actually proceed. </w:t>
       </w:r>
       <w:r>
         <w:rPr>
@@ -664,7 +862,52 @@
         <w:t xml:space="preserve">Theoretical view: </w:t>
       </w:r>
       <w:r>
-        <w:t xml:space="preserve"> **Bordin (1979)** proposed the **working alliance** as a pantheoretical model with three interdependent parts, namely agreement on **goals**, agreement on **tasks**, and the emotional **bond** of trust and liking between the pair. </w:t>
+        <w:t xml:space="preserve"> </w:t>
+      </w:r>
+      <w:r>
+        <w:rPr>
+          <w:b/>
+        </w:rPr>
+        <w:t>Bordin (1979)</w:t>
+      </w:r>
+      <w:r>
+        <w:t xml:space="preserve"> proposed the </w:t>
+      </w:r>
+      <w:r>
+        <w:rPr>
+          <w:b/>
+        </w:rPr>
+        <w:t>working alliance</w:t>
+      </w:r>
+      <w:r>
+        <w:t xml:space="preserve"> as a pantheoretical model with three interdependent parts, namely agreement on </w:t>
+      </w:r>
+      <w:r>
+        <w:rPr>
+          <w:b/>
+        </w:rPr>
+        <w:t>goals</w:t>
+      </w:r>
+      <w:r>
+        <w:t xml:space="preserve">, agreement on </w:t>
+      </w:r>
+      <w:r>
+        <w:rPr>
+          <w:b/>
+        </w:rPr>
+        <w:t>tasks</w:t>
+      </w:r>
+      <w:r>
+        <w:t xml:space="preserve">, and the emotional </w:t>
+      </w:r>
+      <w:r>
+        <w:rPr>
+          <w:b/>
+        </w:rPr>
+        <w:t>bond</w:t>
+      </w:r>
+      <w:r>
+        <w:t xml:space="preserve"> of trust and liking between the pair. </w:t>
       </w:r>
       <w:r>
         <w:rPr>
@@ -679,7 +922,34 @@
         <w:pStyle w:val="ListBullet"/>
       </w:pPr>
       <w:r>
-        <w:t xml:space="preserve">In Bordin's model **goals** are the agreed outcomes the client wants, **tasks** are the in-session activities believed to reach them, and the **bond** is the affective tie that makes the shared work feel safe and worthwhile. </w:t>
+        <w:t xml:space="preserve">In Bordin's model </w:t>
+      </w:r>
+      <w:r>
+        <w:rPr>
+          <w:b/>
+        </w:rPr>
+        <w:t>goals</w:t>
+      </w:r>
+      <w:r>
+        <w:t xml:space="preserve"> are the agreed outcomes the client wants, </w:t>
+      </w:r>
+      <w:r>
+        <w:rPr>
+          <w:b/>
+        </w:rPr>
+        <w:t>tasks</w:t>
+      </w:r>
+      <w:r>
+        <w:t xml:space="preserve"> are the in-session activities believed to reach them, and the </w:t>
+      </w:r>
+      <w:r>
+        <w:rPr>
+          <w:b/>
+        </w:rPr>
+        <w:t>bond</w:t>
+      </w:r>
+      <w:r>
+        <w:t xml:space="preserve"> is the affective tie that makes the shared work feel safe and worthwhile. </w:t>
       </w:r>
       <w:r>
         <w:rPr>
@@ -700,7 +970,25 @@
         <w:t xml:space="preserve">Theoretical view: </w:t>
       </w:r>
       <w:r>
-        <w:t xml:space="preserve"> **Rogers (1957)** named three **core conditions**, which are accurate </w:t>
+        <w:t xml:space="preserve"> </w:t>
+      </w:r>
+      <w:r>
+        <w:rPr>
+          <w:b/>
+        </w:rPr>
+        <w:t>Rogers (1957)</w:t>
+      </w:r>
+      <w:r>
+        <w:t xml:space="preserve"> named three </w:t>
+      </w:r>
+      <w:r>
+        <w:rPr>
+          <w:b/>
+        </w:rPr>
+        <w:t>core conditions</w:t>
+      </w:r>
+      <w:r>
+        <w:t xml:space="preserve">, which are accurate </w:t>
       </w:r>
       <w:r>
         <w:t xml:space="preserve">empathy </w:t>
@@ -751,7 +1039,16 @@
         <w:pStyle w:val="ListBullet"/>
       </w:pPr>
       <w:r>
-        <w:t xml:space="preserve">Rogers stressed that the core conditions must be **perceived by the client**, because warmth and understanding only help when the client actually experiences them, not merely when the therapist intends them. </w:t>
+        <w:t xml:space="preserve">Rogers stressed that the core conditions must be </w:t>
+      </w:r>
+      <w:r>
+        <w:rPr>
+          <w:b/>
+        </w:rPr>
+        <w:t>perceived by the client</w:t>
+      </w:r>
+      <w:r>
+        <w:t xml:space="preserve">, because warmth and understanding only help when the client actually experiences them, not merely when the therapist intends them. </w:t>
       </w:r>
       <w:r>
         <w:rPr>
@@ -772,7 +1069,43 @@
         <w:t xml:space="preserve">Theoretical view: </w:t>
       </w:r>
       <w:r>
-        <w:t xml:space="preserve"> **Greenson (1967) and Gelso** split the relationship into three strands, namely the **working alliance**, the **transference-countertransference** configuration, and the **real relationship** of genuine, realistic perceptions of each other. </w:t>
+        <w:t xml:space="preserve"> </w:t>
+      </w:r>
+      <w:r>
+        <w:rPr>
+          <w:b/>
+        </w:rPr>
+        <w:t>Greenson (1967) and Gelso</w:t>
+      </w:r>
+      <w:r>
+        <w:t xml:space="preserve"> split the relationship into three strands, namely the </w:t>
+      </w:r>
+      <w:r>
+        <w:rPr>
+          <w:b/>
+        </w:rPr>
+        <w:t>working alliance</w:t>
+      </w:r>
+      <w:r>
+        <w:t xml:space="preserve">, the </w:t>
+      </w:r>
+      <w:r>
+        <w:rPr>
+          <w:b/>
+        </w:rPr>
+        <w:t>transference-countertransference</w:t>
+      </w:r>
+      <w:r>
+        <w:t xml:space="preserve"> configuration, and the </w:t>
+      </w:r>
+      <w:r>
+        <w:rPr>
+          <w:b/>
+        </w:rPr>
+        <w:t>real relationship</w:t>
+      </w:r>
+      <w:r>
+        <w:t xml:space="preserve"> of genuine, realistic perceptions of each other. </w:t>
       </w:r>
       <w:r>
         <w:rPr>
@@ -793,7 +1126,52 @@
         <w:t xml:space="preserve">Theoretical view: </w:t>
       </w:r>
       <w:r>
-        <w:t xml:space="preserve"> **Luborsky** described a **helping alliance** with two types, the first being the client's experience of the therapist as **supportive**, and the second a sense of **shared work** toward common goals, while **Zetzel** used the alliance as the basis for analytic work. </w:t>
+        <w:t xml:space="preserve"> </w:t>
+      </w:r>
+      <w:r>
+        <w:rPr>
+          <w:b/>
+        </w:rPr>
+        <w:t>Luborsky</w:t>
+      </w:r>
+      <w:r>
+        <w:t xml:space="preserve"> described a </w:t>
+      </w:r>
+      <w:r>
+        <w:rPr>
+          <w:b/>
+        </w:rPr>
+        <w:t>helping alliance</w:t>
+      </w:r>
+      <w:r>
+        <w:t xml:space="preserve"> with two types, the first being the client's experience of the therapist as </w:t>
+      </w:r>
+      <w:r>
+        <w:rPr>
+          <w:b/>
+        </w:rPr>
+        <w:t>supportive</w:t>
+      </w:r>
+      <w:r>
+        <w:t xml:space="preserve">, and the second a sense of </w:t>
+      </w:r>
+      <w:r>
+        <w:rPr>
+          <w:b/>
+        </w:rPr>
+        <w:t>shared work</w:t>
+      </w:r>
+      <w:r>
+        <w:t xml:space="preserve"> toward common goals, while </w:t>
+      </w:r>
+      <w:r>
+        <w:rPr>
+          <w:b/>
+        </w:rPr>
+        <w:t>Zetzel</w:t>
+      </w:r>
+      <w:r>
+        <w:t xml:space="preserve"> used the alliance as the basis for analytic work. </w:t>
       </w:r>
       <w:r>
         <w:rPr>
@@ -814,7 +1192,25 @@
         <w:t xml:space="preserve">Theoretical view: </w:t>
       </w:r>
       <w:r>
-        <w:t xml:space="preserve"> From an **attachment** perspective after **Bowlby**, the therapist functions as a </w:t>
+        <w:t xml:space="preserve"> From an </w:t>
+      </w:r>
+      <w:r>
+        <w:rPr>
+          <w:b/>
+        </w:rPr>
+        <w:t>attachment</w:t>
+      </w:r>
+      <w:r>
+        <w:t xml:space="preserve"> perspective after </w:t>
+      </w:r>
+      <w:r>
+        <w:rPr>
+          <w:b/>
+        </w:rPr>
+        <w:t>Bowlby</w:t>
+      </w:r>
+      <w:r>
+        <w:t xml:space="preserve">, the therapist functions as a </w:t>
       </w:r>
       <w:r>
         <w:t xml:space="preserve">secure base </w:t>
@@ -874,7 +1270,25 @@
         <w:t>(the therapist's own emotional reactions to the client)</w:t>
       </w:r>
       <w:r>
-        <w:t xml:space="preserve"> is managed through **self-awareness and supervision** and can be used as **information** about what the client evokes in others. </w:t>
+        <w:t xml:space="preserve"> is managed through </w:t>
+      </w:r>
+      <w:r>
+        <w:rPr>
+          <w:b/>
+        </w:rPr>
+        <w:t>self-awareness and supervision</w:t>
+      </w:r>
+      <w:r>
+        <w:t xml:space="preserve"> and can be used as </w:t>
+      </w:r>
+      <w:r>
+        <w:rPr>
+          <w:b/>
+        </w:rPr>
+        <w:t>information</w:t>
+      </w:r>
+      <w:r>
+        <w:t xml:space="preserve"> about what the client evokes in others. </w:t>
       </w:r>
       <w:r>
         <w:rPr>
@@ -913,7 +1327,34 @@
         <w:pStyle w:val="ListBullet"/>
       </w:pPr>
       <w:r>
-        <w:t xml:space="preserve">The relationship moves through **stages**, namely engagement and formation, a deepening **working** phase, and **termination**, where ending is itself therapeutic because it can revive earlier experiences of loss and separation. </w:t>
+        <w:t xml:space="preserve">The relationship moves through </w:t>
+      </w:r>
+      <w:r>
+        <w:rPr>
+          <w:b/>
+        </w:rPr>
+        <w:t>stages</w:t>
+      </w:r>
+      <w:r>
+        <w:t xml:space="preserve">, namely engagement and formation, a deepening </w:t>
+      </w:r>
+      <w:r>
+        <w:rPr>
+          <w:b/>
+        </w:rPr>
+        <w:t>working</w:t>
+      </w:r>
+      <w:r>
+        <w:t xml:space="preserve"> phase, and </w:t>
+      </w:r>
+      <w:r>
+        <w:rPr>
+          <w:b/>
+        </w:rPr>
+        <w:t>termination</w:t>
+      </w:r>
+      <w:r>
+        <w:t xml:space="preserve">, where ending is itself therapeutic because it can revive earlier experiences of loss and separation. </w:t>
       </w:r>
       <w:r>
         <w:rPr>
@@ -1041,7 +1482,16 @@
         <w:t xml:space="preserve">Theoretical view: </w:t>
       </w:r>
       <w:r>
-        <w:t xml:space="preserve"> **Prochaska and DiClemente's** stages of change run through </w:t>
+        <w:t xml:space="preserve"> </w:t>
+      </w:r>
+      <w:r>
+        <w:rPr>
+          <w:b/>
+        </w:rPr>
+        <w:t>Prochaska and DiClemente's</w:t>
+      </w:r>
+      <w:r>
+        <w:t xml:space="preserve"> stages of change run through </w:t>
       </w:r>
       <w:r>
         <w:t xml:space="preserve">precontemplation </w:t>
@@ -1053,7 +1503,16 @@
         <w:t>(not yet seeing a problem)</w:t>
       </w:r>
       <w:r>
-        <w:t xml:space="preserve">, contemplation, preparation, action, maintenance and relapse, and interventions work best when **matched to the client's stage**. </w:t>
+        <w:t xml:space="preserve">, contemplation, preparation, action, maintenance and relapse, and interventions work best when </w:t>
+      </w:r>
+      <w:r>
+        <w:rPr>
+          <w:b/>
+        </w:rPr>
+        <w:t>matched to the client's stage</w:t>
+      </w:r>
+      <w:r>
+        <w:t xml:space="preserve">. </w:t>
       </w:r>
       <w:r>
         <w:rPr>
@@ -1068,7 +1527,25 @@
         <w:pStyle w:val="ListBullet"/>
       </w:pPr>
       <w:r>
-        <w:t xml:space="preserve">Confronting a **precontemplative** client who does not yet want change typically **provokes resistance**, so a gentler, exploratory stance such as motivational interviewing builds the bond far better early on. </w:t>
+        <w:t xml:space="preserve">Confronting a </w:t>
+      </w:r>
+      <w:r>
+        <w:rPr>
+          <w:b/>
+        </w:rPr>
+        <w:t>precontemplative</w:t>
+      </w:r>
+      <w:r>
+        <w:t xml:space="preserve"> client who does not yet want change typically </w:t>
+      </w:r>
+      <w:r>
+        <w:rPr>
+          <w:b/>
+        </w:rPr>
+        <w:t>provokes resistance</w:t>
+      </w:r>
+      <w:r>
+        <w:t xml:space="preserve">, so a gentler, exploratory stance such as motivational interviewing builds the bond far better early on. </w:t>
       </w:r>
       <w:r>
         <w:rPr>
@@ -1083,7 +1560,25 @@
         <w:pStyle w:val="ListBullet"/>
       </w:pPr>
       <w:r>
-        <w:t xml:space="preserve">A client's **expectations and hope** are a major common factor, because someone who believes therapy can help engages more fully, while **role expectations** shape what they think the work will involve. </w:t>
+        <w:t xml:space="preserve">A client's </w:t>
+      </w:r>
+      <w:r>
+        <w:rPr>
+          <w:b/>
+        </w:rPr>
+        <w:t>expectations and hope</w:t>
+      </w:r>
+      <w:r>
+        <w:t xml:space="preserve"> are a major common factor, because someone who believes therapy can help engages more fully, while </w:t>
+      </w:r>
+      <w:r>
+        <w:rPr>
+          <w:b/>
+        </w:rPr>
+        <w:t>role expectations</w:t>
+      </w:r>
+      <w:r>
+        <w:t xml:space="preserve"> shape what they think the work will involve. </w:t>
       </w:r>
       <w:r>
         <w:rPr>
@@ -1098,7 +1593,22 @@
         <w:pStyle w:val="ListBullet"/>
       </w:pPr>
       <w:r>
-        <w:t xml:space="preserve">**Attachment style** predicts how the bond forms, since **secure** clients build an alliance quickly whereas insecure styles make trust slower and more effortful to establish. </w:t>
+        <w:rPr>
+          <w:b/>
+        </w:rPr>
+        <w:t>Attachment style</w:t>
+      </w:r>
+      <w:r>
+        <w:t xml:space="preserve"> predicts how the bond forms, since </w:t>
+      </w:r>
+      <w:r>
+        <w:rPr>
+          <w:b/>
+        </w:rPr>
+        <w:t>secure</w:t>
+      </w:r>
+      <w:r>
+        <w:t xml:space="preserve"> clients build an alliance quickly whereas insecure styles make trust slower and more effortful to establish. </w:t>
       </w:r>
       <w:r>
         <w:rPr>
@@ -1113,7 +1623,49 @@
         <w:pStyle w:val="ListBullet"/>
       </w:pPr>
       <w:r>
-        <w:t xml:space="preserve">**Avoidant** clients tend to keep **emotional distance**, **anxious-ambivalent** clients may become **over-dependent**, and **disorganised** clients often show frequent ruptures that the therapist must patiently repair. </w:t>
+        <w:rPr>
+          <w:b/>
+        </w:rPr>
+        <w:t>Avoidant</w:t>
+      </w:r>
+      <w:r>
+        <w:t xml:space="preserve"> clients tend to keep </w:t>
+      </w:r>
+      <w:r>
+        <w:rPr>
+          <w:b/>
+        </w:rPr>
+        <w:t>emotional distance</w:t>
+      </w:r>
+      <w:r>
+        <w:t xml:space="preserve">, </w:t>
+      </w:r>
+      <w:r>
+        <w:rPr>
+          <w:b/>
+        </w:rPr>
+        <w:t>anxious-ambivalent</w:t>
+      </w:r>
+      <w:r>
+        <w:t xml:space="preserve"> clients may become </w:t>
+      </w:r>
+      <w:r>
+        <w:rPr>
+          <w:b/>
+        </w:rPr>
+        <w:t>over-dependent</w:t>
+      </w:r>
+      <w:r>
+        <w:t xml:space="preserve">, and </w:t>
+      </w:r>
+      <w:r>
+        <w:rPr>
+          <w:b/>
+        </w:rPr>
+        <w:t>disorganised</w:t>
+      </w:r>
+      <w:r>
+        <w:t xml:space="preserve"> clients often show frequent ruptures that the therapist must patiently repair. </w:t>
       </w:r>
       <w:r>
         <w:rPr>
@@ -1134,7 +1686,34 @@
         <w:t xml:space="preserve">Theoretical view: </w:t>
       </w:r>
       <w:r>
-        <w:t xml:space="preserve"> **Beutler** distinguishes coping styles, so that **externalising** clients who act out suit symptom-focused methods while **internalising** clients who turn inward suit insight-oriented work. </w:t>
+        <w:t xml:space="preserve"> </w:t>
+      </w:r>
+      <w:r>
+        <w:rPr>
+          <w:b/>
+        </w:rPr>
+        <w:t>Beutler</w:t>
+      </w:r>
+      <w:r>
+        <w:t xml:space="preserve"> distinguishes coping styles, so that </w:t>
+      </w:r>
+      <w:r>
+        <w:rPr>
+          <w:b/>
+        </w:rPr>
+        <w:t>externalising</w:t>
+      </w:r>
+      <w:r>
+        <w:t xml:space="preserve"> clients who act out suit symptom-focused methods while </w:t>
+      </w:r>
+      <w:r>
+        <w:rPr>
+          <w:b/>
+        </w:rPr>
+        <w:t>internalising</w:t>
+      </w:r>
+      <w:r>
+        <w:t xml:space="preserve"> clients who turn inward suit insight-oriented work. </w:t>
       </w:r>
       <w:r>
         <w:rPr>
@@ -1155,7 +1734,16 @@
         <w:t xml:space="preserve">Theoretical view: </w:t>
       </w:r>
       <w:r>
-        <w:t xml:space="preserve"> **Reactance**, meaning a client's </w:t>
+        <w:t xml:space="preserve"> </w:t>
+      </w:r>
+      <w:r>
+        <w:rPr>
+          <w:b/>
+        </w:rPr>
+        <w:t>Reactance</w:t>
+      </w:r>
+      <w:r>
+        <w:t xml:space="preserve">, meaning a client's </w:t>
       </w:r>
       <w:r>
         <w:t xml:space="preserve">sensitivity to being controlled </w:t>
@@ -1167,7 +1755,25 @@
         <w:t>(a tendency to resist perceived pressure on their freedom)</w:t>
       </w:r>
       <w:r>
-        <w:t xml:space="preserve">, matters because **high-reactance** clients do better with **non-directive** approaches that leave them in charge. </w:t>
+        <w:t xml:space="preserve">, matters because </w:t>
+      </w:r>
+      <w:r>
+        <w:rPr>
+          <w:b/>
+        </w:rPr>
+        <w:t>high-reactance</w:t>
+      </w:r>
+      <w:r>
+        <w:t xml:space="preserve"> clients do better with </w:t>
+      </w:r>
+      <w:r>
+        <w:rPr>
+          <w:b/>
+        </w:rPr>
+        <w:t>non-directive</w:t>
+      </w:r>
+      <w:r>
+        <w:t xml:space="preserve"> approaches that leave them in charge. </w:t>
       </w:r>
       <w:r>
         <w:rPr>
@@ -1182,7 +1788,13 @@
         <w:pStyle w:val="ListBullet"/>
       </w:pPr>
       <w:r>
-        <w:t xml:space="preserve">**Psychological mindedness**, insight, verbal ability and intelligence ease </w:t>
+        <w:rPr>
+          <w:b/>
+        </w:rPr>
+        <w:t>Psychological mindedness</w:t>
+      </w:r>
+      <w:r>
+        <w:t xml:space="preserve">, insight, verbal ability and intelligence ease </w:t>
       </w:r>
       <w:r>
         <w:t xml:space="preserve">insight-oriented therapy </w:t>
@@ -1209,7 +1821,34 @@
         <w:pStyle w:val="ListBullet"/>
       </w:pPr>
       <w:r>
-        <w:t xml:space="preserve">The old **YAVIS** stereotype (young, attractive, verbal, intelligent, successful) versus the **HOUND** stereotype (homely, old, unintelligent, non-verbal, disadvantaged) exposes a long-standing **bias** toward favouring easier, more articulate clients. </w:t>
+        <w:t xml:space="preserve">The old </w:t>
+      </w:r>
+      <w:r>
+        <w:rPr>
+          <w:b/>
+        </w:rPr>
+        <w:t>YAVIS</w:t>
+      </w:r>
+      <w:r>
+        <w:t xml:space="preserve"> stereotype (young, attractive, verbal, intelligent, successful) versus the </w:t>
+      </w:r>
+      <w:r>
+        <w:rPr>
+          <w:b/>
+        </w:rPr>
+        <w:t>HOUND</w:t>
+      </w:r>
+      <w:r>
+        <w:t xml:space="preserve"> stereotype (homely, old, unintelligent, non-verbal, disadvantaged) exposes a long-standing </w:t>
+      </w:r>
+      <w:r>
+        <w:rPr>
+          <w:b/>
+        </w:rPr>
+        <w:t>bias</w:t>
+      </w:r>
+      <w:r>
+        <w:t xml:space="preserve"> toward favouring easier, more articulate clients. </w:t>
       </w:r>
       <w:r>
         <w:rPr>
@@ -1224,7 +1863,22 @@
         <w:pStyle w:val="ListBullet"/>
       </w:pPr>
       <w:r>
-        <w:t xml:space="preserve">**Culture and demographics** such as age, gender, language, religion and beliefs about illness shape the bond, and a **culturally mismatched** therapy that ignores these often ends in early dropout. </w:t>
+        <w:rPr>
+          <w:b/>
+        </w:rPr>
+        <w:t>Culture and demographics</w:t>
+      </w:r>
+      <w:r>
+        <w:t xml:space="preserve"> such as age, gender, language, religion and beliefs about illness shape the bond, and a </w:t>
+      </w:r>
+      <w:r>
+        <w:rPr>
+          <w:b/>
+        </w:rPr>
+        <w:t>culturally mismatched</w:t>
+      </w:r>
+      <w:r>
+        <w:t xml:space="preserve"> therapy that ignores these often ends in early dropout. </w:t>
       </w:r>
       <w:r>
         <w:rPr>
@@ -1239,7 +1893,34 @@
         <w:pStyle w:val="ListBullet"/>
       </w:pPr>
       <w:r>
-        <w:t xml:space="preserve">Clients who explain distress through **spiritual or somatic** frames, or who face heavy **stigma** and strong family expectations, need the therapist to work respectfully **within** that worldview rather than against it. </w:t>
+        <w:t xml:space="preserve">Clients who explain distress through </w:t>
+      </w:r>
+      <w:r>
+        <w:rPr>
+          <w:b/>
+        </w:rPr>
+        <w:t>spiritual or somatic</w:t>
+      </w:r>
+      <w:r>
+        <w:t xml:space="preserve"> frames, or who face heavy </w:t>
+      </w:r>
+      <w:r>
+        <w:rPr>
+          <w:b/>
+        </w:rPr>
+        <w:t>stigma</w:t>
+      </w:r>
+      <w:r>
+        <w:t xml:space="preserve"> and strong family expectations, need the therapist to work respectfully </w:t>
+      </w:r>
+      <w:r>
+        <w:rPr>
+          <w:b/>
+        </w:rPr>
+        <w:t>within</w:t>
+      </w:r>
+      <w:r>
+        <w:t xml:space="preserve"> that worldview rather than against it. </w:t>
       </w:r>
       <w:r>
         <w:rPr>
@@ -1254,7 +1935,22 @@
         <w:pStyle w:val="ListBullet"/>
       </w:pPr>
       <w:r>
-        <w:t xml:space="preserve">**Severity, distress and functioning** matter, because severe impairment, marked interpersonal difficulty and **chronic** problems all make a stable alliance harder and slower to achieve. </w:t>
+        <w:rPr>
+          <w:b/>
+        </w:rPr>
+        <w:t>Severity, distress and functioning</w:t>
+      </w:r>
+      <w:r>
+        <w:t xml:space="preserve"> matter, because severe impairment, marked interpersonal difficulty and </w:t>
+      </w:r>
+      <w:r>
+        <w:rPr>
+          <w:b/>
+        </w:rPr>
+        <w:t>chronic</w:t>
+      </w:r>
+      <w:r>
+        <w:t xml:space="preserve"> problems all make a stable alliance harder and slower to achieve. </w:t>
       </w:r>
       <w:r>
         <w:rPr>
@@ -1269,7 +1965,16 @@
         <w:pStyle w:val="ListBullet"/>
       </w:pPr>
       <w:r>
-        <w:t xml:space="preserve">A client's **previous therapy experience** colours the new relationship, so that past help that failed lowers hope while a past good experience primes trust in the current therapist. </w:t>
+        <w:t xml:space="preserve">A client's </w:t>
+      </w:r>
+      <w:r>
+        <w:rPr>
+          <w:b/>
+        </w:rPr>
+        <w:t>previous therapy experience</w:t>
+      </w:r>
+      <w:r>
+        <w:t xml:space="preserve"> colours the new relationship, so that past help that failed lowers hope while a past good experience primes trust in the current therapist. </w:t>
       </w:r>
       <w:r>
         <w:rPr>
@@ -1284,7 +1989,34 @@
         <w:pStyle w:val="ListBullet"/>
       </w:pPr>
       <w:r>
-        <w:t xml:space="preserve">The **referral source** matters, because a **voluntary** client who seeks help engages more readily than a **mandated** or family-pushed client who may feel coerced into attending. </w:t>
+        <w:t xml:space="preserve">The </w:t>
+      </w:r>
+      <w:r>
+        <w:rPr>
+          <w:b/>
+        </w:rPr>
+        <w:t>referral source</w:t>
+      </w:r>
+      <w:r>
+        <w:t xml:space="preserve"> matters, because a </w:t>
+      </w:r>
+      <w:r>
+        <w:rPr>
+          <w:b/>
+        </w:rPr>
+        <w:t>voluntary</w:t>
+      </w:r>
+      <w:r>
+        <w:t xml:space="preserve"> client who seeks help engages more readily than a </w:t>
+      </w:r>
+      <w:r>
+        <w:rPr>
+          <w:b/>
+        </w:rPr>
+        <w:t>mandated</w:t>
+      </w:r>
+      <w:r>
+        <w:t xml:space="preserve"> or family-pushed client who may feel coerced into attending. </w:t>
       </w:r>
       <w:r>
         <w:rPr>
@@ -1299,7 +2031,16 @@
         <w:pStyle w:val="ListBullet"/>
       </w:pPr>
       <w:r>
-        <w:t xml:space="preserve">A client's **social support and life circumstances**, including housing, finances and relationships, shape the energy and stability they can bring to the therapeutic work. </w:t>
+        <w:t xml:space="preserve">A client's </w:t>
+      </w:r>
+      <w:r>
+        <w:rPr>
+          <w:b/>
+        </w:rPr>
+        <w:t>social support and life circumstances</w:t>
+      </w:r>
+      <w:r>
+        <w:t xml:space="preserve">, including housing, finances and relationships, shape the energy and stability they can bring to the therapeutic work. </w:t>
       </w:r>
       <w:r>
         <w:rPr>
@@ -1361,7 +2102,25 @@
         <w:pStyle w:val="ListBullet"/>
       </w:pPr>
       <w:r>
-        <w:t xml:space="preserve">The core **personal qualities** are **empathy, warmth and genuineness**, together with respect, trustworthiness, patience and a hope-inspiring attitude that together let the client feel understood and safe. </w:t>
+        <w:t xml:space="preserve">The core </w:t>
+      </w:r>
+      <w:r>
+        <w:rPr>
+          <w:b/>
+        </w:rPr>
+        <w:t>personal qualities</w:t>
+      </w:r>
+      <w:r>
+        <w:t xml:space="preserve"> are </w:t>
+      </w:r>
+      <w:r>
+        <w:rPr>
+          <w:b/>
+        </w:rPr>
+        <w:t>empathy, warmth and genuineness</w:t>
+      </w:r>
+      <w:r>
+        <w:t xml:space="preserve">, together with respect, trustworthiness, patience and a hope-inspiring attitude that together let the client feel understood and safe. </w:t>
       </w:r>
       <w:r>
         <w:rPr>
@@ -1376,7 +2135,13 @@
         <w:pStyle w:val="ListBullet"/>
       </w:pPr>
       <w:r>
-        <w:t xml:space="preserve">**Emotional stability, flexibility, humour, self-awareness** and tolerance of ambiguity help the therapist stay steady and responsive when the client is distressed, hostile or ambivalent. </w:t>
+        <w:rPr>
+          <w:b/>
+        </w:rPr>
+        <w:t>Emotional stability, flexibility, humour, self-awareness</w:t>
+      </w:r>
+      <w:r>
+        <w:t xml:space="preserve"> and tolerance of ambiguity help the therapist stay steady and responsive when the client is distressed, hostile or ambivalent. </w:t>
       </w:r>
       <w:r>
         <w:rPr>
@@ -1391,7 +2156,22 @@
         <w:pStyle w:val="ListBullet"/>
       </w:pPr>
       <w:r>
-        <w:t xml:space="preserve">**Professional competence** rests on training, experience, supervision and the capacity to **formulate** a case and adapt the treatment, so skill and character work together rather than separately. </w:t>
+        <w:rPr>
+          <w:b/>
+        </w:rPr>
+        <w:t>Professional competence</w:t>
+      </w:r>
+      <w:r>
+        <w:t xml:space="preserve"> rests on training, experience, supervision and the capacity to </w:t>
+      </w:r>
+      <w:r>
+        <w:rPr>
+          <w:b/>
+        </w:rPr>
+        <w:t>formulate</w:t>
+      </w:r>
+      <w:r>
+        <w:t xml:space="preserve"> a case and adapt the treatment, so skill and character work together rather than separately. </w:t>
       </w:r>
       <w:r>
         <w:rPr>
@@ -1436,7 +2216,34 @@
         <w:t xml:space="preserve">Theoretical view: </w:t>
       </w:r>
       <w:r>
-        <w:t xml:space="preserve"> **Therapist effects** are real, meaning some therapists consistently achieve **better outcomes** than others, and these differences between therapists are often **larger** than the differences between treatment methods. </w:t>
+        <w:t xml:space="preserve"> </w:t>
+      </w:r>
+      <w:r>
+        <w:rPr>
+          <w:b/>
+        </w:rPr>
+        <w:t>Therapist effects</w:t>
+      </w:r>
+      <w:r>
+        <w:t xml:space="preserve"> are real, meaning some therapists consistently achieve </w:t>
+      </w:r>
+      <w:r>
+        <w:rPr>
+          <w:b/>
+        </w:rPr>
+        <w:t>better outcomes</w:t>
+      </w:r>
+      <w:r>
+        <w:t xml:space="preserve"> than others, and these differences between therapists are often </w:t>
+      </w:r>
+      <w:r>
+        <w:rPr>
+          <w:b/>
+        </w:rPr>
+        <w:t>larger</w:t>
+      </w:r>
+      <w:r>
+        <w:t xml:space="preserve"> than the differences between treatment methods. </w:t>
       </w:r>
       <w:r>
         <w:rPr>
@@ -1451,7 +2258,22 @@
         <w:pStyle w:val="ListBullet"/>
       </w:pPr>
       <w:r>
-        <w:t xml:space="preserve">**Therapeutic stance and style**, such as how **directive** or active the therapist is, must be tuned to the client, because a style that suits one client can alienate another. </w:t>
+        <w:rPr>
+          <w:b/>
+        </w:rPr>
+        <w:t>Therapeutic stance and style</w:t>
+      </w:r>
+      <w:r>
+        <w:t xml:space="preserve">, such as how </w:t>
+      </w:r>
+      <w:r>
+        <w:rPr>
+          <w:b/>
+        </w:rPr>
+        <w:t>directive</w:t>
+      </w:r>
+      <w:r>
+        <w:t xml:space="preserve"> or active the therapist is, must be tuned to the client, because a style that suits one client can alienate another. </w:t>
       </w:r>
       <w:r>
         <w:rPr>
@@ -1475,7 +2297,16 @@
         <w:t>(the therapist sharing something personal)</w:t>
       </w:r>
       <w:r>
-        <w:t xml:space="preserve"> can strengthen the bond when it is **brief and serves the client**, but harms the work when it shifts the focus onto the therapist's own needs. </w:t>
+        <w:t xml:space="preserve"> can strengthen the bond when it is </w:t>
+      </w:r>
+      <w:r>
+        <w:rPr>
+          <w:b/>
+        </w:rPr>
+        <w:t>brief and serves the client</w:t>
+      </w:r>
+      <w:r>
+        <w:t xml:space="preserve">, but harms the work when it shifts the focus onto the therapist's own needs. </w:t>
       </w:r>
       <w:r>
         <w:rPr>
@@ -1490,7 +2321,22 @@
         <w:pStyle w:val="ListBullet"/>
       </w:pPr>
       <w:r>
-        <w:t xml:space="preserve">**Countertransference** from unresolved conflicts, a need to **rescue**, over-identification, anger, boredom or attraction can distort the relationship unless the therapist notices and works on it. </w:t>
+        <w:rPr>
+          <w:b/>
+        </w:rPr>
+        <w:t>Countertransference</w:t>
+      </w:r>
+      <w:r>
+        <w:t xml:space="preserve"> from unresolved conflicts, a need to </w:t>
+      </w:r>
+      <w:r>
+        <w:rPr>
+          <w:b/>
+        </w:rPr>
+        <w:t>rescue</w:t>
+      </w:r>
+      <w:r>
+        <w:t xml:space="preserve">, over-identification, anger, boredom or attraction can distort the relationship unless the therapist notices and works on it. </w:t>
       </w:r>
       <w:r>
         <w:rPr>
@@ -1505,7 +2351,13 @@
         <w:pStyle w:val="ListBullet"/>
       </w:pPr>
       <w:r>
-        <w:t xml:space="preserve">**Supervision and personal work** are the main safeguards, letting the therapist process their reactions so that personal blind spots do not silently damage the alliance. </w:t>
+        <w:rPr>
+          <w:b/>
+        </w:rPr>
+        <w:t>Supervision and personal work</w:t>
+      </w:r>
+      <w:r>
+        <w:t xml:space="preserve"> are the main safeguards, letting the therapist process their reactions so that personal blind spots do not silently damage the alliance. </w:t>
       </w:r>
       <w:r>
         <w:rPr>
@@ -1520,7 +2372,25 @@
         <w:pStyle w:val="ListBullet"/>
       </w:pPr>
       <w:r>
-        <w:t xml:space="preserve">A therapist's **expectations and belief** in the treatment, together with genuine **positive regard** for the client, raise the client's own hope and strengthen engagement. </w:t>
+        <w:t xml:space="preserve">A therapist's </w:t>
+      </w:r>
+      <w:r>
+        <w:rPr>
+          <w:b/>
+        </w:rPr>
+        <w:t>expectations and belief</w:t>
+      </w:r>
+      <w:r>
+        <w:t xml:space="preserve"> in the treatment, together with genuine </w:t>
+      </w:r>
+      <w:r>
+        <w:rPr>
+          <w:b/>
+        </w:rPr>
+        <w:t>positive regard</w:t>
+      </w:r>
+      <w:r>
+        <w:t xml:space="preserve"> for the client, raise the client's own hope and strengthen engagement. </w:t>
       </w:r>
       <w:r>
         <w:rPr>
@@ -1535,7 +2405,22 @@
         <w:pStyle w:val="ListBullet"/>
       </w:pPr>
       <w:r>
-        <w:t xml:space="preserve">**Demographic matching** of gender, ethnicity or language can comfort some clients, but it matters **less** than the therapist's warmth, respect and cultural responsiveness. </w:t>
+        <w:rPr>
+          <w:b/>
+        </w:rPr>
+        <w:t>Demographic matching</w:t>
+      </w:r>
+      <w:r>
+        <w:t xml:space="preserve"> of gender, ethnicity or language can comfort some clients, but it matters </w:t>
+      </w:r>
+      <w:r>
+        <w:rPr>
+          <w:b/>
+        </w:rPr>
+        <w:t>less</w:t>
+      </w:r>
+      <w:r>
+        <w:t xml:space="preserve"> than the therapist's warmth, respect and cultural responsiveness. </w:t>
       </w:r>
       <w:r>
         <w:rPr>
@@ -1556,7 +2441,25 @@
         <w:t xml:space="preserve">Professional code: </w:t>
       </w:r>
       <w:r>
-        <w:t xml:space="preserve"> **Competence and ethical conduct** are professional obligations, and in India the **RCI Act 1992** sets standards of conduct and etiquette for registered rehabilitation professionals including clinical psychologists. </w:t>
+        <w:t xml:space="preserve"> </w:t>
+      </w:r>
+      <w:r>
+        <w:rPr>
+          <w:b/>
+        </w:rPr>
+        <w:t>Competence and ethical conduct</w:t>
+      </w:r>
+      <w:r>
+        <w:t xml:space="preserve"> are professional obligations, and in India the </w:t>
+      </w:r>
+      <w:r>
+        <w:rPr>
+          <w:b/>
+        </w:rPr>
+        <w:t>RCI Act 1992</w:t>
+      </w:r>
+      <w:r>
+        <w:t xml:space="preserve"> sets standards of conduct and etiquette for registered rehabilitation professionals including clinical psychologists. </w:t>
       </w:r>
       <w:r>
         <w:rPr>
@@ -1571,7 +2474,13 @@
         <w:pStyle w:val="ListBullet"/>
       </w:pPr>
       <w:r>
-        <w:t xml:space="preserve">**Burnout** erodes empathy and patience, so a depleted or overloaded therapist forms weaker alliances, which makes self-care an ethical as well as a personal concern. </w:t>
+        <w:rPr>
+          <w:b/>
+        </w:rPr>
+        <w:t>Burnout</w:t>
+      </w:r>
+      <w:r>
+        <w:t xml:space="preserve"> erodes empathy and patience, so a depleted or overloaded therapist forms weaker alliances, which makes self-care an ethical as well as a personal concern. </w:t>
       </w:r>
       <w:r>
         <w:rPr>
@@ -1586,7 +2495,13 @@
         <w:pStyle w:val="ListBullet"/>
       </w:pPr>
       <w:r>
-        <w:t xml:space="preserve">**Harmful therapist qualities** include coldness, rigidity, authoritarianism, criticism, over-involvement and disrespect for boundaries, all of which damage trust and can make the client worse. </w:t>
+        <w:rPr>
+          <w:b/>
+        </w:rPr>
+        <w:t>Harmful therapist qualities</w:t>
+      </w:r>
+      <w:r>
+        <w:t xml:space="preserve"> include coldness, rigidity, authoritarianism, criticism, over-involvement and disrespect for boundaries, all of which damage trust and can make the client worse. </w:t>
       </w:r>
       <w:r>
         <w:rPr>
@@ -1601,7 +2516,16 @@
         <w:pStyle w:val="ListBullet"/>
       </w:pPr>
       <w:r>
-        <w:t xml:space="preserve">The decisive variable is the **therapist's attitude** toward the client, since a respectful, responsive and self-aware therapist builds strong alliances across a wide range of clients and problems. </w:t>
+        <w:t xml:space="preserve">The decisive variable is the </w:t>
+      </w:r>
+      <w:r>
+        <w:rPr>
+          <w:b/>
+        </w:rPr>
+        <w:t>therapist's attitude</w:t>
+      </w:r>
+      <w:r>
+        <w:t xml:space="preserve"> toward the client, since a respectful, responsive and self-aware therapist builds strong alliances across a wide range of clients and problems. </w:t>
       </w:r>
       <w:r>
         <w:rPr>
@@ -1663,7 +2587,34 @@
         <w:pStyle w:val="ListBullet"/>
       </w:pPr>
       <w:r>
-        <w:t xml:space="preserve">Alliances form most **easily** with mild to moderate **anxiety** and **adjustment** problems, because such clients usually retain insight, motivation and the capacity to collaborate. </w:t>
+        <w:t xml:space="preserve">Alliances form most </w:t>
+      </w:r>
+      <w:r>
+        <w:rPr>
+          <w:b/>
+        </w:rPr>
+        <w:t>easily</w:t>
+      </w:r>
+      <w:r>
+        <w:t xml:space="preserve"> with mild to moderate </w:t>
+      </w:r>
+      <w:r>
+        <w:rPr>
+          <w:b/>
+        </w:rPr>
+        <w:t>anxiety</w:t>
+      </w:r>
+      <w:r>
+        <w:t xml:space="preserve"> and </w:t>
+      </w:r>
+      <w:r>
+        <w:rPr>
+          <w:b/>
+        </w:rPr>
+        <w:t>adjustment</w:t>
+      </w:r>
+      <w:r>
+        <w:t xml:space="preserve"> problems, because such clients usually retain insight, motivation and the capacity to collaborate. </w:t>
       </w:r>
       <w:r>
         <w:rPr>
@@ -1678,7 +2629,22 @@
         <w:pStyle w:val="ListBullet"/>
       </w:pPr>
       <w:r>
-        <w:t xml:space="preserve">**Personality disorders**, especially **borderline, paranoid and antisocial** presentations, strain the bond through mistrust, testing and rapid shifts, so the alliance needs careful, consistent tending. </w:t>
+        <w:rPr>
+          <w:b/>
+        </w:rPr>
+        <w:t>Personality disorders</w:t>
+      </w:r>
+      <w:r>
+        <w:t xml:space="preserve">, especially </w:t>
+      </w:r>
+      <w:r>
+        <w:rPr>
+          <w:b/>
+        </w:rPr>
+        <w:t>borderline, paranoid and antisocial</w:t>
+      </w:r>
+      <w:r>
+        <w:t xml:space="preserve"> presentations, strain the bond through mistrust, testing and rapid shifts, so the alliance needs careful, consistent tending. </w:t>
       </w:r>
       <w:r>
         <w:rPr>
@@ -1693,7 +2659,22 @@
         <w:pStyle w:val="ListBullet"/>
       </w:pPr>
       <w:r>
-        <w:t xml:space="preserve">**Psychosis** makes engagement hard because **suspicion and poor insight** can lead the client to doubt the therapist's intentions, so trust is built slowly and concretely. </w:t>
+        <w:rPr>
+          <w:b/>
+        </w:rPr>
+        <w:t>Psychosis</w:t>
+      </w:r>
+      <w:r>
+        <w:t xml:space="preserve"> makes engagement hard because </w:t>
+      </w:r>
+      <w:r>
+        <w:rPr>
+          <w:b/>
+        </w:rPr>
+        <w:t>suspicion and poor insight</w:t>
+      </w:r>
+      <w:r>
+        <w:t xml:space="preserve"> can lead the client to doubt the therapist's intentions, so trust is built slowly and concretely. </w:t>
       </w:r>
       <w:r>
         <w:rPr>
@@ -1708,7 +2689,22 @@
         <w:pStyle w:val="ListBullet"/>
       </w:pPr>
       <w:r>
-        <w:t xml:space="preserve">**Severe depression** brings **withdrawal, hopelessness and low energy**, which slow responsiveness and mean the therapist must carry more of the early activity and warmth. </w:t>
+        <w:rPr>
+          <w:b/>
+        </w:rPr>
+        <w:t>Severe depression</w:t>
+      </w:r>
+      <w:r>
+        <w:t xml:space="preserve"> brings </w:t>
+      </w:r>
+      <w:r>
+        <w:rPr>
+          <w:b/>
+        </w:rPr>
+        <w:t>withdrawal, hopelessness and low energy</w:t>
+      </w:r>
+      <w:r>
+        <w:t xml:space="preserve">, which slow responsiveness and mean the therapist must carry more of the early activity and warmth. </w:t>
       </w:r>
       <w:r>
         <w:rPr>
@@ -1723,7 +2719,31 @@
         <w:pStyle w:val="ListBullet"/>
       </w:pPr>
       <w:r>
-        <w:t xml:space="preserve">**Substance use** often involves **denial and ambivalence**, while **eating disorders** carry ambivalence about recovery, so both call for a non-confrontational, motivation-building stance early on. </w:t>
+        <w:rPr>
+          <w:b/>
+        </w:rPr>
+        <w:t>Substance use</w:t>
+      </w:r>
+      <w:r>
+        <w:t xml:space="preserve"> often involves </w:t>
+      </w:r>
+      <w:r>
+        <w:rPr>
+          <w:b/>
+        </w:rPr>
+        <w:t>denial and ambivalence</w:t>
+      </w:r>
+      <w:r>
+        <w:t xml:space="preserve">, while </w:t>
+      </w:r>
+      <w:r>
+        <w:rPr>
+          <w:b/>
+        </w:rPr>
+        <w:t>eating disorders</w:t>
+      </w:r>
+      <w:r>
+        <w:t xml:space="preserve"> carry ambivalence about recovery, so both call for a non-confrontational, motivation-building stance early on. </w:t>
       </w:r>
       <w:r>
         <w:rPr>
@@ -1738,7 +2758,22 @@
         <w:pStyle w:val="ListBullet"/>
       </w:pPr>
       <w:r>
-        <w:t xml:space="preserve">**Severity and chronicity** lengthen the time to build a bond, and repeated **failed treatments** lower hope, so the therapist must actively rebuild expectation of improvement. </w:t>
+        <w:rPr>
+          <w:b/>
+        </w:rPr>
+        <w:t>Severity and chronicity</w:t>
+      </w:r>
+      <w:r>
+        <w:t xml:space="preserve"> lengthen the time to build a bond, and repeated </w:t>
+      </w:r>
+      <w:r>
+        <w:rPr>
+          <w:b/>
+        </w:rPr>
+        <w:t>failed treatments</w:t>
+      </w:r>
+      <w:r>
+        <w:t xml:space="preserve"> lower hope, so the therapist must actively rebuild expectation of improvement. </w:t>
       </w:r>
       <w:r>
         <w:rPr>
@@ -1753,7 +2788,16 @@
         <w:pStyle w:val="ListBullet"/>
       </w:pPr>
       <w:r>
-        <w:t xml:space="preserve">Poor **insight and motivation**, as in acute psychosis or mania, reduce collaboration, so the work may begin with engagement and psychoeducation rather than deeper therapeutic tasks. </w:t>
+        <w:t xml:space="preserve">Poor </w:t>
+      </w:r>
+      <w:r>
+        <w:rPr>
+          <w:b/>
+        </w:rPr>
+        <w:t>insight and motivation</w:t>
+      </w:r>
+      <w:r>
+        <w:t xml:space="preserve">, as in acute psychosis or mania, reduce collaboration, so the work may begin with engagement and psychoeducation rather than deeper therapeutic tasks. </w:t>
       </w:r>
       <w:r>
         <w:rPr>
@@ -1768,7 +2812,13 @@
         <w:pStyle w:val="ListBullet"/>
       </w:pPr>
       <w:r>
-        <w:t xml:space="preserve">**Comorbidity**, such as depression combined with anxiety or substance use, complicates the picture and can divide the client's attention and the alliance across competing problems. </w:t>
+        <w:rPr>
+          <w:b/>
+        </w:rPr>
+        <w:t>Comorbidity</w:t>
+      </w:r>
+      <w:r>
+        <w:t xml:space="preserve">, such as depression combined with anxiety or substance use, complicates the picture and can divide the client's attention and the alliance across competing problems. </w:t>
       </w:r>
       <w:r>
         <w:rPr>
@@ -1783,7 +2833,22 @@
         <w:pStyle w:val="ListBullet"/>
       </w:pPr>
       <w:r>
-        <w:t xml:space="preserve">**Suicidality and risk** demand a more **active, structured** stance and may strain boundaries, because safety planning and monitoring temporarily reshape the usual therapeutic frame. </w:t>
+        <w:rPr>
+          <w:b/>
+        </w:rPr>
+        <w:t>Suicidality and risk</w:t>
+      </w:r>
+      <w:r>
+        <w:t xml:space="preserve"> demand a more </w:t>
+      </w:r>
+      <w:r>
+        <w:rPr>
+          <w:b/>
+        </w:rPr>
+        <w:t>active, structured</w:t>
+      </w:r>
+      <w:r>
+        <w:t xml:space="preserve"> stance and may strain boundaries, because safety planning and monitoring temporarily reshape the usual therapeutic frame. </w:t>
       </w:r>
       <w:r>
         <w:rPr>
@@ -1804,7 +2869,16 @@
         <w:t xml:space="preserve">Professional code: </w:t>
       </w:r>
       <w:r>
-        <w:t xml:space="preserve"> Managing risk also engages legal and ethical duties, since the **APA Ethics Code 2017** permits disclosure without consent to protect the client or others from serious harm. </w:t>
+        <w:t xml:space="preserve"> Managing risk also engages legal and ethical duties, since the </w:t>
+      </w:r>
+      <w:r>
+        <w:rPr>
+          <w:b/>
+        </w:rPr>
+        <w:t>APA Ethics Code 2017</w:t>
+      </w:r>
+      <w:r>
+        <w:t xml:space="preserve"> permits disclosure without consent to protect the client or others from serious harm. </w:t>
       </w:r>
       <w:r>
         <w:rPr>
@@ -1819,7 +2893,25 @@
         <w:pStyle w:val="ListBullet"/>
       </w:pPr>
       <w:r>
-        <w:t xml:space="preserve">A **trauma and abuse** history makes trust difficult, so the therapist prioritises **safety and gradual pacing**, letting the client set the speed rather than pressing for early disclosure. </w:t>
+        <w:t xml:space="preserve">A </w:t>
+      </w:r>
+      <w:r>
+        <w:rPr>
+          <w:b/>
+        </w:rPr>
+        <w:t>trauma and abuse</w:t>
+      </w:r>
+      <w:r>
+        <w:t xml:space="preserve"> history makes trust difficult, so the therapist prioritises </w:t>
+      </w:r>
+      <w:r>
+        <w:rPr>
+          <w:b/>
+        </w:rPr>
+        <w:t>safety and gradual pacing</w:t>
+      </w:r>
+      <w:r>
+        <w:t xml:space="preserve">, letting the client set the speed rather than pressing for early disclosure. </w:t>
       </w:r>
       <w:r>
         <w:rPr>
@@ -1834,7 +2926,22 @@
         <w:pStyle w:val="ListBullet"/>
       </w:pPr>
       <w:r>
-        <w:t xml:space="preserve">**Cognitive impairment** from organic disorders or intellectual disability calls for **simplified communication** and often family involvement, which changes the shape of the relationship. </w:t>
+        <w:rPr>
+          <w:b/>
+        </w:rPr>
+        <w:t>Cognitive impairment</w:t>
+      </w:r>
+      <w:r>
+        <w:t xml:space="preserve"> from organic disorders or intellectual disability calls for </w:t>
+      </w:r>
+      <w:r>
+        <w:rPr>
+          <w:b/>
+        </w:rPr>
+        <w:t>simplified communication</w:t>
+      </w:r>
+      <w:r>
+        <w:t xml:space="preserve"> and often family involvement, which changes the shape of the relationship. </w:t>
       </w:r>
       <w:r>
         <w:rPr>
@@ -1849,7 +2956,13 @@
         <w:pStyle w:val="ListBullet"/>
       </w:pPr>
       <w:r>
-        <w:t xml:space="preserve">**Medication and physical illness**, through sedation, side effects, pain or fatigue, affect engagement and alertness, so the therapist adapts session length and expectations accordingly. </w:t>
+        <w:rPr>
+          <w:b/>
+        </w:rPr>
+        <w:t>Medication and physical illness</w:t>
+      </w:r>
+      <w:r>
+        <w:t xml:space="preserve">, through sedation, side effects, pain or fatigue, affect engagement and alertness, so the therapist adapts session length and expectations accordingly. </w:t>
       </w:r>
       <w:r>
         <w:rPr>
@@ -1864,7 +2977,25 @@
         <w:pStyle w:val="ListBullet"/>
       </w:pPr>
       <w:r>
-        <w:t xml:space="preserve">Across presentations the principle holds that the **sicker or more mistrustful** the client, the more the therapist must **adjust pace, structure and activity** to protect a fragile bond. </w:t>
+        <w:t xml:space="preserve">Across presentations the principle holds that the </w:t>
+      </w:r>
+      <w:r>
+        <w:rPr>
+          <w:b/>
+        </w:rPr>
+        <w:t>sicker or more mistrustful</w:t>
+      </w:r>
+      <w:r>
+        <w:t xml:space="preserve"> the client, the more the therapist must </w:t>
+      </w:r>
+      <w:r>
+        <w:rPr>
+          <w:b/>
+        </w:rPr>
+        <w:t>adjust pace, structure and activity</w:t>
+      </w:r>
+      <w:r>
+        <w:t xml:space="preserve"> to protect a fragile bond. </w:t>
       </w:r>
       <w:r>
         <w:rPr>
@@ -1932,7 +3063,52 @@
         <w:t xml:space="preserve">Theoretical view: </w:t>
       </w:r>
       <w:r>
-        <w:t xml:space="preserve"> **Beutler's prescriptive matching** tailors the method to the client, so **directive** techniques suit **low-reactance** clients while **non-directive** work suits **high-reactance** clients. </w:t>
+        <w:t xml:space="preserve"> </w:t>
+      </w:r>
+      <w:r>
+        <w:rPr>
+          <w:b/>
+        </w:rPr>
+        <w:t>Beutler's prescriptive matching</w:t>
+      </w:r>
+      <w:r>
+        <w:t xml:space="preserve"> tailors the method to the client, so </w:t>
+      </w:r>
+      <w:r>
+        <w:rPr>
+          <w:b/>
+        </w:rPr>
+        <w:t>directive</w:t>
+      </w:r>
+      <w:r>
+        <w:t xml:space="preserve"> techniques suit </w:t>
+      </w:r>
+      <w:r>
+        <w:rPr>
+          <w:b/>
+        </w:rPr>
+        <w:t>low-reactance</w:t>
+      </w:r>
+      <w:r>
+        <w:t xml:space="preserve"> clients while </w:t>
+      </w:r>
+      <w:r>
+        <w:rPr>
+          <w:b/>
+        </w:rPr>
+        <w:t>non-directive</w:t>
+      </w:r>
+      <w:r>
+        <w:t xml:space="preserve"> work suits </w:t>
+      </w:r>
+      <w:r>
+        <w:rPr>
+          <w:b/>
+        </w:rPr>
+        <w:t>high-reactance</w:t>
+      </w:r>
+      <w:r>
+        <w:t xml:space="preserve"> clients. </w:t>
       </w:r>
       <w:r>
         <w:rPr>
@@ -1947,7 +3123,43 @@
         <w:pStyle w:val="ListBullet"/>
       </w:pPr>
       <w:r>
-        <w:t xml:space="preserve">Matching also follows coping style, with **symptom-focused** techniques suiting **externalisers** and **insight-focused** work suiting **internalisers**, so a good fit itself supports the bond. </w:t>
+        <w:t xml:space="preserve">Matching also follows coping style, with </w:t>
+      </w:r>
+      <w:r>
+        <w:rPr>
+          <w:b/>
+        </w:rPr>
+        <w:t>symptom-focused</w:t>
+      </w:r>
+      <w:r>
+        <w:t xml:space="preserve"> techniques suiting </w:t>
+      </w:r>
+      <w:r>
+        <w:rPr>
+          <w:b/>
+        </w:rPr>
+        <w:t>externalisers</w:t>
+      </w:r>
+      <w:r>
+        <w:t xml:space="preserve"> and </w:t>
+      </w:r>
+      <w:r>
+        <w:rPr>
+          <w:b/>
+        </w:rPr>
+        <w:t>insight-focused</w:t>
+      </w:r>
+      <w:r>
+        <w:t xml:space="preserve"> work suiting </w:t>
+      </w:r>
+      <w:r>
+        <w:rPr>
+          <w:b/>
+        </w:rPr>
+        <w:t>internalisers</w:t>
+      </w:r>
+      <w:r>
+        <w:t xml:space="preserve">, so a good fit itself supports the bond. </w:t>
       </w:r>
       <w:r>
         <w:rPr>
@@ -1962,7 +3174,25 @@
         <w:pStyle w:val="ListBullet"/>
       </w:pPr>
       <w:r>
-        <w:t xml:space="preserve">A **clear, credible rationale** for the treatment raises the client's **expectation** and strengthens the alliance, because people engage more when they understand why a task should help. </w:t>
+        <w:t xml:space="preserve">A </w:t>
+      </w:r>
+      <w:r>
+        <w:rPr>
+          <w:b/>
+        </w:rPr>
+        <w:t>clear, credible rationale</w:t>
+      </w:r>
+      <w:r>
+        <w:t xml:space="preserve"> for the treatment raises the client's </w:t>
+      </w:r>
+      <w:r>
+        <w:rPr>
+          <w:b/>
+        </w:rPr>
+        <w:t>expectation</w:t>
+      </w:r>
+      <w:r>
+        <w:t xml:space="preserve"> and strengthens the alliance, because people engage more when they understand why a task should help. </w:t>
       </w:r>
       <w:r>
         <w:rPr>
@@ -1977,7 +3207,13 @@
         <w:pStyle w:val="ListBullet"/>
       </w:pPr>
       <w:r>
-        <w:t xml:space="preserve">**Timing and accuracy** of interventions matter, so a well-timed, accurate </w:t>
+        <w:rPr>
+          <w:b/>
+        </w:rPr>
+        <w:t>Timing and accuracy</w:t>
+      </w:r>
+      <w:r>
+        <w:t xml:space="preserve"> of interventions matter, so a well-timed, accurate </w:t>
       </w:r>
       <w:r>
         <w:t xml:space="preserve">interpretation </w:t>
@@ -2004,7 +3240,25 @@
         <w:pStyle w:val="ListBullet"/>
       </w:pPr>
       <w:r>
-        <w:t xml:space="preserve">A **premature or inaccurate** interpretation tends to produce **defensiveness**, because the client feels misunderstood or exposed before enough trust has been built. </w:t>
+        <w:t xml:space="preserve">A </w:t>
+      </w:r>
+      <w:r>
+        <w:rPr>
+          <w:b/>
+        </w:rPr>
+        <w:t>premature or inaccurate</w:t>
+      </w:r>
+      <w:r>
+        <w:t xml:space="preserve"> interpretation tends to produce </w:t>
+      </w:r>
+      <w:r>
+        <w:rPr>
+          <w:b/>
+        </w:rPr>
+        <w:t>defensiveness</w:t>
+      </w:r>
+      <w:r>
+        <w:t xml:space="preserve">, because the client feels misunderstood or exposed before enough trust has been built. </w:t>
       </w:r>
       <w:r>
         <w:rPr>
@@ -2019,7 +3273,34 @@
         <w:pStyle w:val="ListBullet"/>
       </w:pPr>
       <w:r>
-        <w:t xml:space="preserve">An overly **directive** style can trigger **reactance** in clients who resist being controlled, while an overly **passive** style can leave clients feeling confused, unheld or frustrated. </w:t>
+        <w:t xml:space="preserve">An overly </w:t>
+      </w:r>
+      <w:r>
+        <w:rPr>
+          <w:b/>
+        </w:rPr>
+        <w:t>directive</w:t>
+      </w:r>
+      <w:r>
+        <w:t xml:space="preserve"> style can trigger </w:t>
+      </w:r>
+      <w:r>
+        <w:rPr>
+          <w:b/>
+        </w:rPr>
+        <w:t>reactance</w:t>
+      </w:r>
+      <w:r>
+        <w:t xml:space="preserve"> in clients who resist being controlled, while an overly </w:t>
+      </w:r>
+      <w:r>
+        <w:rPr>
+          <w:b/>
+        </w:rPr>
+        <w:t>passive</w:t>
+      </w:r>
+      <w:r>
+        <w:t xml:space="preserve"> style can leave clients feeling confused, unheld or frustrated. </w:t>
       </w:r>
       <w:r>
         <w:rPr>
@@ -2034,7 +3315,22 @@
         <w:pStyle w:val="ListBullet"/>
       </w:pPr>
       <w:r>
-        <w:t xml:space="preserve">**Confrontation, exposure or challenging** techniques used too early can strain the alliance, so the **bond is built first** and demanding work is introduced once trust can bear it. </w:t>
+        <w:rPr>
+          <w:b/>
+        </w:rPr>
+        <w:t>Confrontation, exposure or challenging</w:t>
+      </w:r>
+      <w:r>
+        <w:t xml:space="preserve"> techniques used too early can strain the alliance, so the </w:t>
+      </w:r>
+      <w:r>
+        <w:rPr>
+          <w:b/>
+        </w:rPr>
+        <w:t>bond is built first</w:t>
+      </w:r>
+      <w:r>
+        <w:t xml:space="preserve"> and demanding work is introduced once trust can bear it. </w:t>
       </w:r>
       <w:r>
         <w:rPr>
@@ -2058,7 +3354,16 @@
         <w:t>(adjusting the plan to the client in the moment)</w:t>
       </w:r>
       <w:r>
-        <w:t xml:space="preserve"> improves the alliance, whereas **rigid manual adherence** in the face of a rupture tends to worsen it. </w:t>
+        <w:t xml:space="preserve"> improves the alliance, whereas </w:t>
+      </w:r>
+      <w:r>
+        <w:rPr>
+          <w:b/>
+        </w:rPr>
+        <w:t>rigid manual adherence</w:t>
+      </w:r>
+      <w:r>
+        <w:t xml:space="preserve"> in the face of a rupture tends to worsen it. </w:t>
       </w:r>
       <w:r>
         <w:rPr>
@@ -2073,7 +3378,22 @@
         <w:pStyle w:val="ListBullet"/>
       </w:pPr>
       <w:r>
-        <w:t xml:space="preserve">**Homework and between-session tasks** shape the **task agreement**, so negotiating tasks the client sees as relevant and doable keeps the collaborative part of the bond strong. </w:t>
+        <w:rPr>
+          <w:b/>
+        </w:rPr>
+        <w:t>Homework and between-session tasks</w:t>
+      </w:r>
+      <w:r>
+        <w:t xml:space="preserve"> shape the </w:t>
+      </w:r>
+      <w:r>
+        <w:rPr>
+          <w:b/>
+        </w:rPr>
+        <w:t>task agreement</w:t>
+      </w:r>
+      <w:r>
+        <w:t xml:space="preserve">, so negotiating tasks the client sees as relevant and doable keeps the collaborative part of the bond strong. </w:t>
       </w:r>
       <w:r>
         <w:rPr>
@@ -2088,7 +3408,16 @@
         <w:pStyle w:val="ListBullet"/>
       </w:pPr>
       <w:r>
-        <w:t xml:space="preserve">The **format** of therapy, whether individual, group or family, changes the relationship, since group and family work add multiple bonds and shared cohesion to manage. </w:t>
+        <w:t xml:space="preserve">The </w:t>
+      </w:r>
+      <w:r>
+        <w:rPr>
+          <w:b/>
+        </w:rPr>
+        <w:t>format</w:t>
+      </w:r>
+      <w:r>
+        <w:t xml:space="preserve"> of therapy, whether individual, group or family, changes the relationship, since group and family work add multiple bonds and shared cohesion to manage. </w:t>
       </w:r>
       <w:r>
         <w:rPr>
@@ -2103,7 +3432,31 @@
         <w:pStyle w:val="ListBullet"/>
       </w:pPr>
       <w:r>
-        <w:t xml:space="preserve">**Teletherapy** by video can produce an alliance **comparable** to in-person work, but it is vulnerable to **technical problems** and the loss of some non-verbal cues. </w:t>
+        <w:rPr>
+          <w:b/>
+        </w:rPr>
+        <w:t>Teletherapy</w:t>
+      </w:r>
+      <w:r>
+        <w:t xml:space="preserve"> by video can produce an alliance </w:t>
+      </w:r>
+      <w:r>
+        <w:rPr>
+          <w:b/>
+        </w:rPr>
+        <w:t>comparable</w:t>
+      </w:r>
+      <w:r>
+        <w:t xml:space="preserve"> to in-person work, but it is vulnerable to </w:t>
+      </w:r>
+      <w:r>
+        <w:rPr>
+          <w:b/>
+        </w:rPr>
+        <w:t>technical problems</w:t>
+      </w:r>
+      <w:r>
+        <w:t xml:space="preserve"> and the loss of some non-verbal cues. </w:t>
       </w:r>
       <w:r>
         <w:rPr>
@@ -2124,7 +3477,16 @@
         <w:t xml:space="preserve">Guideline: </w:t>
       </w:r>
       <w:r>
-        <w:t xml:space="preserve"> Because flexibility helps, the therapist treats the manual as a **guide not a cage**, adapting technique to the client's reactions while keeping the treatment coherent and evidence-based. </w:t>
+        <w:t xml:space="preserve"> Because flexibility helps, the therapist treats the manual as a </w:t>
+      </w:r>
+      <w:r>
+        <w:rPr>
+          <w:b/>
+        </w:rPr>
+        <w:t>guide not a cage</w:t>
+      </w:r>
+      <w:r>
+        <w:t xml:space="preserve">, adapting technique to the client's reactions while keeping the treatment coherent and evidence-based. </w:t>
       </w:r>
       <w:r>
         <w:rPr>
@@ -2139,7 +3501,25 @@
         <w:pStyle w:val="ListBullet"/>
       </w:pPr>
       <w:r>
-        <w:t xml:space="preserve">The overarching rule is that **technique and relationship interact**, so the best outcomes come from applying an effective method **responsively** within a strong, well-tended alliance. </w:t>
+        <w:t xml:space="preserve">The overarching rule is that </w:t>
+      </w:r>
+      <w:r>
+        <w:rPr>
+          <w:b/>
+        </w:rPr>
+        <w:t>technique and relationship interact</w:t>
+      </w:r>
+      <w:r>
+        <w:t xml:space="preserve">, so the best outcomes come from applying an effective method </w:t>
+      </w:r>
+      <w:r>
+        <w:rPr>
+          <w:b/>
+        </w:rPr>
+        <w:t>responsively</w:t>
+      </w:r>
+      <w:r>
+        <w:t xml:space="preserve"> within a strong, well-tended alliance. </w:t>
       </w:r>
       <w:r>
         <w:rPr>
@@ -2209,7 +3589,16 @@
         <w:pStyle w:val="ListBullet"/>
       </w:pPr>
       <w:r>
-        <w:t xml:space="preserve">The **therapy frame** of privacy, comfort, location, fees, session length, frequency and cancellation policy sets the stable conditions within which trust can grow. </w:t>
+        <w:t xml:space="preserve">The </w:t>
+      </w:r>
+      <w:r>
+        <w:rPr>
+          <w:b/>
+        </w:rPr>
+        <w:t>therapy frame</w:t>
+      </w:r>
+      <w:r>
+        <w:t xml:space="preserve"> of privacy, comfort, location, fees, session length, frequency and cancellation policy sets the stable conditions within which trust can grow. </w:t>
       </w:r>
       <w:r>
         <w:rPr>
@@ -2224,7 +3613,22 @@
         <w:pStyle w:val="ListBullet"/>
       </w:pPr>
       <w:r>
-        <w:t xml:space="preserve">**Duration** affects depth, because a longer treatment allows a deeper bond while **abrupt endings** strain the relationship and can reactivate earlier experiences of loss. </w:t>
+        <w:rPr>
+          <w:b/>
+        </w:rPr>
+        <w:t>Duration</w:t>
+      </w:r>
+      <w:r>
+        <w:t xml:space="preserve"> affects depth, because a longer treatment allows a deeper bond while </w:t>
+      </w:r>
+      <w:r>
+        <w:rPr>
+          <w:b/>
+        </w:rPr>
+        <w:t>abrupt endings</w:t>
+      </w:r>
+      <w:r>
+        <w:t xml:space="preserve"> strain the relationship and can reactivate earlier experiences of loss. </w:t>
       </w:r>
       <w:r>
         <w:rPr>
@@ -2239,7 +3643,31 @@
         <w:pStyle w:val="ListBullet"/>
       </w:pPr>
       <w:r>
-        <w:t xml:space="preserve">**Culture and power distance** shape the bond, and in many **Indian** settings clients may defer to the therapist as a **doctor figure** and avoid openly disagreeing, which the therapist must actively invite. </w:t>
+        <w:rPr>
+          <w:b/>
+        </w:rPr>
+        <w:t>Culture and power distance</w:t>
+      </w:r>
+      <w:r>
+        <w:t xml:space="preserve"> shape the bond, and in many </w:t>
+      </w:r>
+      <w:r>
+        <w:rPr>
+          <w:b/>
+        </w:rPr>
+        <w:t>Indian</w:t>
+      </w:r>
+      <w:r>
+        <w:t xml:space="preserve"> settings clients may defer to the therapist as a </w:t>
+      </w:r>
+      <w:r>
+        <w:rPr>
+          <w:b/>
+        </w:rPr>
+        <w:t>doctor figure</w:t>
+      </w:r>
+      <w:r>
+        <w:t xml:space="preserve"> and avoid openly disagreeing, which the therapist must actively invite. </w:t>
       </w:r>
       <w:r>
         <w:rPr>
@@ -2254,7 +3682,13 @@
         <w:pStyle w:val="ListBullet"/>
       </w:pPr>
       <w:r>
-        <w:t xml:space="preserve">**Stigma, language barriers, gender norms and religion** all influence engagement, so the therapist works respectfully within the client's social and cultural world rather than against it. </w:t>
+        <w:rPr>
+          <w:b/>
+        </w:rPr>
+        <w:t>Stigma, language barriers, gender norms and religion</w:t>
+      </w:r>
+      <w:r>
+        <w:t xml:space="preserve"> all influence engagement, so the therapist works respectfully within the client's social and cultural world rather than against it. </w:t>
       </w:r>
       <w:r>
         <w:rPr>
@@ -2269,7 +3703,22 @@
         <w:pStyle w:val="ListBullet"/>
       </w:pPr>
       <w:r>
-        <w:t xml:space="preserve">**Life events and external stress** during therapy, along with **third parties** such as family, insurers or courts in mandated work, pull on the relationship from outside the room. </w:t>
+        <w:rPr>
+          <w:b/>
+        </w:rPr>
+        <w:t>Life events and external stress</w:t>
+      </w:r>
+      <w:r>
+        <w:t xml:space="preserve"> during therapy, along with </w:t>
+      </w:r>
+      <w:r>
+        <w:rPr>
+          <w:b/>
+        </w:rPr>
+        <w:t>third parties</w:t>
+      </w:r>
+      <w:r>
+        <w:t xml:space="preserve"> such as family, insurers or courts in mandated work, pull on the relationship from outside the room. </w:t>
       </w:r>
       <w:r>
         <w:rPr>
@@ -2284,7 +3733,31 @@
         <w:pStyle w:val="ListBullet"/>
       </w:pPr>
       <w:r>
-        <w:t xml:space="preserve">**Therapist-client fit** or chemistry is hard to measure yet important, so inviting **early feedback** and being willing to **refer elsewhere** when the fit is poor is itself good practice. </w:t>
+        <w:rPr>
+          <w:b/>
+        </w:rPr>
+        <w:t>Therapist-client fit</w:t>
+      </w:r>
+      <w:r>
+        <w:t xml:space="preserve"> or chemistry is hard to measure yet important, so inviting </w:t>
+      </w:r>
+      <w:r>
+        <w:rPr>
+          <w:b/>
+        </w:rPr>
+        <w:t>early feedback</w:t>
+      </w:r>
+      <w:r>
+        <w:t xml:space="preserve"> and being willing to </w:t>
+      </w:r>
+      <w:r>
+        <w:rPr>
+          <w:b/>
+        </w:rPr>
+        <w:t>refer elsewhere</w:t>
+      </w:r>
+      <w:r>
+        <w:t xml:space="preserve"> when the fit is poor is itself good practice. </w:t>
       </w:r>
       <w:r>
         <w:rPr>
@@ -2313,7 +3786,16 @@
         <w:t xml:space="preserve">Theoretical view: </w:t>
       </w:r>
       <w:r>
-        <w:t xml:space="preserve"> **Safran and Muran** describe </w:t>
+        <w:t xml:space="preserve"> </w:t>
+      </w:r>
+      <w:r>
+        <w:rPr>
+          <w:b/>
+        </w:rPr>
+        <w:t>Safran and Muran</w:t>
+      </w:r>
+      <w:r>
+        <w:t xml:space="preserve"> describe </w:t>
       </w:r>
       <w:r>
         <w:t xml:space="preserve">ruptures </w:t>
@@ -2325,7 +3807,25 @@
         <w:t>(tensions or breakdowns in the alliance)</w:t>
       </w:r>
       <w:r>
-        <w:t xml:space="preserve"> in two forms, namely **withdrawal** ruptures where the client goes silent, compliant or changes the topic, and **confrontation** ruptures where the client criticises, shows anger or makes demands. </w:t>
+        <w:t xml:space="preserve"> in two forms, namely </w:t>
+      </w:r>
+      <w:r>
+        <w:rPr>
+          <w:b/>
+        </w:rPr>
+        <w:t>withdrawal</w:t>
+      </w:r>
+      <w:r>
+        <w:t xml:space="preserve"> ruptures where the client goes silent, compliant or changes the topic, and </w:t>
+      </w:r>
+      <w:r>
+        <w:rPr>
+          <w:b/>
+        </w:rPr>
+        <w:t>confrontation</w:t>
+      </w:r>
+      <w:r>
+        <w:t xml:space="preserve"> ruptures where the client criticises, shows anger or makes demands. </w:t>
       </w:r>
       <w:r>
         <w:rPr>
@@ -2340,7 +3840,13 @@
         <w:pStyle w:val="ListBullet"/>
       </w:pPr>
       <w:r>
-        <w:t xml:space="preserve">**Repair** uses </w:t>
+        <w:rPr>
+          <w:b/>
+        </w:rPr>
+        <w:t>Repair</w:t>
+      </w:r>
+      <w:r>
+        <w:t xml:space="preserve"> uses </w:t>
       </w:r>
       <w:r>
         <w:t xml:space="preserve">meta-communication </w:t>
@@ -2352,7 +3858,16 @@
         <w:t>(openly talking about what is happening between client and therapist)</w:t>
       </w:r>
       <w:r>
-        <w:t xml:space="preserve">, empathic validation and flexibility with tasks or goals, and is associated with **better outcome**. </w:t>
+        <w:t xml:space="preserve">, empathic validation and flexibility with tasks or goals, and is associated with </w:t>
+      </w:r>
+      <w:r>
+        <w:rPr>
+          <w:b/>
+        </w:rPr>
+        <w:t>better outcome</w:t>
+      </w:r>
+      <w:r>
+        <w:t xml:space="preserve">. </w:t>
       </w:r>
       <w:r>
         <w:rPr>
@@ -2367,7 +3882,16 @@
         <w:pStyle w:val="ListBullet"/>
       </w:pPr>
       <w:r>
-        <w:t xml:space="preserve">A **repaired rupture can strengthen** the alliance, so the rupture-repair cycle is treated as valuable therapeutic material rather than as a failure of the therapist. </w:t>
+        <w:t xml:space="preserve">A </w:t>
+      </w:r>
+      <w:r>
+        <w:rPr>
+          <w:b/>
+        </w:rPr>
+        <w:t>repaired rupture can strengthen</w:t>
+      </w:r>
+      <w:r>
+        <w:t xml:space="preserve"> the alliance, so the rupture-repair cycle is treated as valuable therapeutic material rather than as a failure of the therapist. </w:t>
       </w:r>
       <w:r>
         <w:rPr>
@@ -2382,7 +3906,16 @@
         <w:pStyle w:val="ListBullet"/>
       </w:pPr>
       <w:r>
-        <w:t xml:space="preserve">The therapist **takes responsibility** for their own contribution to a rupture, because owning the strain models honesty and makes it safe for the client to raise future tensions. </w:t>
+        <w:t xml:space="preserve">The therapist </w:t>
+      </w:r>
+      <w:r>
+        <w:rPr>
+          <w:b/>
+        </w:rPr>
+        <w:t>takes responsibility</w:t>
+      </w:r>
+      <w:r>
+        <w:t xml:space="preserve"> for their own contribution to a rupture, because owning the strain models honesty and makes it safe for the client to raise future tensions. </w:t>
       </w:r>
       <w:r>
         <w:rPr>
@@ -2495,7 +4028,25 @@
         <w:t xml:space="preserve">Professional code: </w:t>
       </w:r>
       <w:r>
-        <w:t xml:space="preserve"> **Professional boundaries** protect the client, and the **APA Ethics Code 2017, Standard 3.05 Multiple Relationships** warns against second relationships that could impair objectivity or risk exploitation or harm. </w:t>
+        <w:t xml:space="preserve"> </w:t>
+      </w:r>
+      <w:r>
+        <w:rPr>
+          <w:b/>
+        </w:rPr>
+        <w:t>Professional boundaries</w:t>
+      </w:r>
+      <w:r>
+        <w:t xml:space="preserve"> protect the client, and the </w:t>
+      </w:r>
+      <w:r>
+        <w:rPr>
+          <w:b/>
+        </w:rPr>
+        <w:t>APA Ethics Code 2017, Standard 3.05 Multiple Relationships</w:t>
+      </w:r>
+      <w:r>
+        <w:t xml:space="preserve"> warns against second relationships that could impair objectivity or risk exploitation or harm. </w:t>
       </w:r>
       <w:r>
         <w:rPr>
@@ -2516,7 +4067,25 @@
         <w:t xml:space="preserve">Professional code: </w:t>
       </w:r>
       <w:r>
-        <w:t xml:space="preserve"> The **APA Ethics Code 2017, Standards 10.05 to 10.08** prohibit **sexual intimacies** with current therapy clients and tightly restrict them with former clients, making this one of the clearest boundary rules in the code. </w:t>
+        <w:t xml:space="preserve"> The </w:t>
+      </w:r>
+      <w:r>
+        <w:rPr>
+          <w:b/>
+        </w:rPr>
+        <w:t>APA Ethics Code 2017, Standards 10.05 to 10.08</w:t>
+      </w:r>
+      <w:r>
+        <w:t xml:space="preserve"> prohibit </w:t>
+      </w:r>
+      <w:r>
+        <w:rPr>
+          <w:b/>
+        </w:rPr>
+        <w:t>sexual intimacies</w:t>
+      </w:r>
+      <w:r>
+        <w:t xml:space="preserve"> with current therapy clients and tightly restrict them with former clients, making this one of the clearest boundary rules in the code. </w:t>
       </w:r>
       <w:r>
         <w:rPr>
@@ -2537,7 +4106,25 @@
         <w:t xml:space="preserve">Professional code: </w:t>
       </w:r>
       <w:r>
-        <w:t xml:space="preserve"> In India the **RCI Act 1992** empowers the Rehabilitation Council to prescribe **standards of conduct, etiquette and ethics** for registered professionals, so boundary and competence duties carry statutory backing. </w:t>
+        <w:t xml:space="preserve"> In India the </w:t>
+      </w:r>
+      <w:r>
+        <w:rPr>
+          <w:b/>
+        </w:rPr>
+        <w:t>RCI Act 1992</w:t>
+      </w:r>
+      <w:r>
+        <w:t xml:space="preserve"> empowers the Rehabilitation Council to prescribe </w:t>
+      </w:r>
+      <w:r>
+        <w:rPr>
+          <w:b/>
+        </w:rPr>
+        <w:t>standards of conduct, etiquette and ethics</w:t>
+      </w:r>
+      <w:r>
+        <w:t xml:space="preserve"> for registered professionals, so boundary and competence duties carry statutory backing. </w:t>
       </w:r>
       <w:r>
         <w:rPr>
@@ -2558,7 +4145,25 @@
         <w:t xml:space="preserve">Guideline: </w:t>
       </w:r>
       <w:r>
-        <w:t xml:space="preserve"> The **World Health Organization** likewise frames the provider-client relationship as resting on **trust, respect and confidentiality**, which boundary-keeping is designed to protect. </w:t>
+        <w:t xml:space="preserve"> The </w:t>
+      </w:r>
+      <w:r>
+        <w:rPr>
+          <w:b/>
+        </w:rPr>
+        <w:t>World Health Organization</w:t>
+      </w:r>
+      <w:r>
+        <w:t xml:space="preserve"> likewise frames the provider-client relationship as resting on </w:t>
+      </w:r>
+      <w:r>
+        <w:rPr>
+          <w:b/>
+        </w:rPr>
+        <w:t>trust, respect and confidentiality</w:t>
+      </w:r>
+      <w:r>
+        <w:t xml:space="preserve">, which boundary-keeping is designed to protect. </w:t>
       </w:r>
       <w:r>
         <w:rPr>
@@ -2579,7 +4184,25 @@
         <w:t xml:space="preserve">Secondary source: </w:t>
       </w:r>
       <w:r>
-        <w:t xml:space="preserve"> The **IACP** (Indian Association of Clinical Psychologists) is understood from secondary summaries to broadly **align with APA and RCI** duties on competence and boundaries, and no IACP clause numbers are quoted here because the primary code was not accessed. </w:t>
+        <w:t xml:space="preserve"> The </w:t>
+      </w:r>
+      <w:r>
+        <w:rPr>
+          <w:b/>
+        </w:rPr>
+        <w:t>IACP</w:t>
+      </w:r>
+      <w:r>
+        <w:t xml:space="preserve"> (Indian Association of Clinical Psychologists) is understood from secondary summaries to broadly </w:t>
+      </w:r>
+      <w:r>
+        <w:rPr>
+          <w:b/>
+        </w:rPr>
+        <w:t>align with APA and RCI</w:t>
+      </w:r>
+      <w:r>
+        <w:t xml:space="preserve"> duties on competence and boundaries, and no IACP clause numbers are quoted here because the primary code was not accessed. </w:t>
       </w:r>
       <w:r>
         <w:rPr>
@@ -2594,7 +4217,13 @@
         <w:pStyle w:val="ListBullet"/>
       </w:pPr>
       <w:r>
-        <w:t xml:space="preserve">**Teletherapy** adds boundary and privacy demands, since the therapist must secure the setting, confirm the client's location for safety, and manage confidentiality across the technology used. </w:t>
+        <w:rPr>
+          <w:b/>
+        </w:rPr>
+        <w:t>Teletherapy</w:t>
+      </w:r>
+      <w:r>
+        <w:t xml:space="preserve"> adds boundary and privacy demands, since the therapist must secure the setting, confirm the client's location for safety, and manage confidentiality across the technology used. </w:t>
       </w:r>
       <w:r>
         <w:rPr>
@@ -2656,7 +4285,43 @@
         <w:pStyle w:val="ListBullet"/>
       </w:pPr>
       <w:r>
-        <w:t xml:space="preserve">The alliance is measured with validated self-report and observer scales, chiefly the **Working Alliance Inventory (WAI)** of Horvath and Greenberg, the **California Psychotherapy Alliance Scales (CALPAS)**, the **Helping Alliance Questionnaire (HAq)** and the brief **Session Rating Scale**. </w:t>
+        <w:t xml:space="preserve">The alliance is measured with validated self-report and observer scales, chiefly the </w:t>
+      </w:r>
+      <w:r>
+        <w:rPr>
+          <w:b/>
+        </w:rPr>
+        <w:t>Working Alliance Inventory (WAI)</w:t>
+      </w:r>
+      <w:r>
+        <w:t xml:space="preserve"> of Horvath and Greenberg, the </w:t>
+      </w:r>
+      <w:r>
+        <w:rPr>
+          <w:b/>
+        </w:rPr>
+        <w:t>California Psychotherapy Alliance Scales (CALPAS)</w:t>
+      </w:r>
+      <w:r>
+        <w:t xml:space="preserve">, the </w:t>
+      </w:r>
+      <w:r>
+        <w:rPr>
+          <w:b/>
+        </w:rPr>
+        <w:t>Helping Alliance Questionnaire (HAq)</w:t>
+      </w:r>
+      <w:r>
+        <w:t xml:space="preserve"> and the brief </w:t>
+      </w:r>
+      <w:r>
+        <w:rPr>
+          <w:b/>
+        </w:rPr>
+        <w:t>Session Rating Scale</w:t>
+      </w:r>
+      <w:r>
+        <w:t xml:space="preserve">. </w:t>
       </w:r>
       <w:r>
         <w:rPr>
@@ -2671,7 +4336,25 @@
         <w:pStyle w:val="ListBullet"/>
       </w:pPr>
       <w:r>
-        <w:t xml:space="preserve">The **WAI** follows Bordin directly, scoring the three components of **bond, goals and tasks**, which makes the model measurable and lets therapist and client track the partnership over time. </w:t>
+        <w:t xml:space="preserve">The </w:t>
+      </w:r>
+      <w:r>
+        <w:rPr>
+          <w:b/>
+        </w:rPr>
+        <w:t>WAI</w:t>
+      </w:r>
+      <w:r>
+        <w:t xml:space="preserve"> follows Bordin directly, scoring the three components of </w:t>
+      </w:r>
+      <w:r>
+        <w:rPr>
+          <w:b/>
+        </w:rPr>
+        <w:t>bond, goals and tasks</w:t>
+      </w:r>
+      <w:r>
+        <w:t xml:space="preserve">, which makes the model measurable and lets therapist and client track the partnership over time. </w:t>
       </w:r>
       <w:r>
         <w:rPr>
@@ -2692,7 +4375,43 @@
         <w:t xml:space="preserve">Theoretical view: </w:t>
       </w:r>
       <w:r>
-        <w:t xml:space="preserve"> **Horvath and Symonds (1991)** and later **Horvath et al. (2011)** found a **moderate and consistent** association between alliance and outcome of about **r = .28** across many studies. </w:t>
+        <w:t xml:space="preserve"> </w:t>
+      </w:r>
+      <w:r>
+        <w:rPr>
+          <w:b/>
+        </w:rPr>
+        <w:t>Horvath and Symonds (1991)</w:t>
+      </w:r>
+      <w:r>
+        <w:t xml:space="preserve"> and later </w:t>
+      </w:r>
+      <w:r>
+        <w:rPr>
+          <w:b/>
+        </w:rPr>
+        <w:t>Horvath et al. (2011)</w:t>
+      </w:r>
+      <w:r>
+        <w:t xml:space="preserve"> found a </w:t>
+      </w:r>
+      <w:r>
+        <w:rPr>
+          <w:b/>
+        </w:rPr>
+        <w:t>moderate and consistent</w:t>
+      </w:r>
+      <w:r>
+        <w:t xml:space="preserve"> association between alliance and outcome of about </w:t>
+      </w:r>
+      <w:r>
+        <w:rPr>
+          <w:b/>
+        </w:rPr>
+        <w:t>r = .28</w:t>
+      </w:r>
+      <w:r>
+        <w:t xml:space="preserve"> across many studies. </w:t>
       </w:r>
       <w:r>
         <w:rPr>
@@ -2713,7 +4432,25 @@
         <w:t xml:space="preserve">Theoretical view: </w:t>
       </w:r>
       <w:r>
-        <w:t xml:space="preserve"> **Fluckiger et al. (2018)** confirmed this alliance-outcome link in a large updated meta-analysis, showing it holds across **therapies, diagnoses and formats** rather than being tied to one school. </w:t>
+        <w:t xml:space="preserve"> </w:t>
+      </w:r>
+      <w:r>
+        <w:rPr>
+          <w:b/>
+        </w:rPr>
+        <w:t>Fluckiger et al. (2018)</w:t>
+      </w:r>
+      <w:r>
+        <w:t xml:space="preserve"> confirmed this alliance-outcome link in a large updated meta-analysis, showing it holds across </w:t>
+      </w:r>
+      <w:r>
+        <w:rPr>
+          <w:b/>
+        </w:rPr>
+        <w:t>therapies, diagnoses and formats</w:t>
+      </w:r>
+      <w:r>
+        <w:t xml:space="preserve"> rather than being tied to one school. </w:t>
       </w:r>
       <w:r>
         <w:rPr>
@@ -2728,7 +4465,16 @@
         <w:pStyle w:val="ListBullet"/>
       </w:pPr>
       <w:r>
-        <w:t xml:space="preserve">The relationship is held to explain **more outcome variance** than the specific technique for many disorders, which is why common-factors researchers place the alliance at the centre of effective therapy. </w:t>
+        <w:t xml:space="preserve">The relationship is held to explain </w:t>
+      </w:r>
+      <w:r>
+        <w:rPr>
+          <w:b/>
+        </w:rPr>
+        <w:t>more outcome variance</w:t>
+      </w:r>
+      <w:r>
+        <w:t xml:space="preserve"> than the specific technique for many disorders, which is why common-factors researchers place the alliance at the centre of effective therapy. </w:t>
       </w:r>
       <w:r>
         <w:rPr>
@@ -2743,7 +4489,25 @@
         <w:pStyle w:val="ListBullet"/>
       </w:pPr>
       <w:r>
-        <w:t xml:space="preserve">The **early alliance**, often measured by sessions three to five, **predicts** later outcome, so monitoring the bond early gives a practical, actionable warning sign well before termination. </w:t>
+        <w:t xml:space="preserve">The </w:t>
+      </w:r>
+      <w:r>
+        <w:rPr>
+          <w:b/>
+        </w:rPr>
+        <w:t>early alliance</w:t>
+      </w:r>
+      <w:r>
+        <w:t xml:space="preserve">, often measured by sessions three to five, </w:t>
+      </w:r>
+      <w:r>
+        <w:rPr>
+          <w:b/>
+        </w:rPr>
+        <w:t>predicts</w:t>
+      </w:r>
+      <w:r>
+        <w:t xml:space="preserve"> later outcome, so monitoring the bond early gives a practical, actionable warning sign well before termination. </w:t>
       </w:r>
       <w:r>
         <w:rPr>
@@ -2758,7 +4522,34 @@
         <w:pStyle w:val="ListBullet"/>
       </w:pPr>
       <w:r>
-        <w:t xml:space="preserve">Causation runs **both ways**, because a good alliance partly **causes** improvement and is partly an **effect** of early symptom relief, so the two reinforce each other over a course of therapy. </w:t>
+        <w:t xml:space="preserve">Causation runs </w:t>
+      </w:r>
+      <w:r>
+        <w:rPr>
+          <w:b/>
+        </w:rPr>
+        <w:t>both ways</w:t>
+      </w:r>
+      <w:r>
+        <w:t xml:space="preserve">, because a good alliance partly </w:t>
+      </w:r>
+      <w:r>
+        <w:rPr>
+          <w:b/>
+        </w:rPr>
+        <w:t>causes</w:t>
+      </w:r>
+      <w:r>
+        <w:t xml:space="preserve"> improvement and is partly an </w:t>
+      </w:r>
+      <w:r>
+        <w:rPr>
+          <w:b/>
+        </w:rPr>
+        <w:t>effect</w:t>
+      </w:r>
+      <w:r>
+        <w:t xml:space="preserve"> of early symptom relief, so the two reinforce each other over a course of therapy. </w:t>
       </w:r>
       <w:r>
         <w:rPr>
@@ -2779,7 +4570,43 @@
         <w:t xml:space="preserve">Guideline: </w:t>
       </w:r>
       <w:r>
-        <w:t xml:space="preserve"> The **Norcross and Lambert** APA task force classified the **alliance, empathy, goal consensus, group cohesion** and **collecting client feedback** as **demonstrably effective** relationship elements. </w:t>
+        <w:t xml:space="preserve"> The </w:t>
+      </w:r>
+      <w:r>
+        <w:rPr>
+          <w:b/>
+        </w:rPr>
+        <w:t>Norcross and Lambert</w:t>
+      </w:r>
+      <w:r>
+        <w:t xml:space="preserve"> APA task force classified the </w:t>
+      </w:r>
+      <w:r>
+        <w:rPr>
+          <w:b/>
+        </w:rPr>
+        <w:t>alliance, empathy, goal consensus, group cohesion</w:t>
+      </w:r>
+      <w:r>
+        <w:t xml:space="preserve"> and </w:t>
+      </w:r>
+      <w:r>
+        <w:rPr>
+          <w:b/>
+        </w:rPr>
+        <w:t>collecting client feedback</w:t>
+      </w:r>
+      <w:r>
+        <w:t xml:space="preserve"> as </w:t>
+      </w:r>
+      <w:r>
+        <w:rPr>
+          <w:b/>
+        </w:rPr>
+        <w:t>demonstrably effective</w:t>
+      </w:r>
+      <w:r>
+        <w:t xml:space="preserve"> relationship elements. </w:t>
       </w:r>
       <w:r>
         <w:rPr>
@@ -2794,7 +4621,13 @@
         <w:pStyle w:val="ListBullet"/>
       </w:pPr>
       <w:r>
-        <w:t xml:space="preserve">**Routine feedback**, using brief alliance and outcome measures each session, lets the therapist catch a weakening bond and repair it, which is itself linked to better results. </w:t>
+        <w:rPr>
+          <w:b/>
+        </w:rPr>
+        <w:t>Routine feedback</w:t>
+      </w:r>
+      <w:r>
+        <w:t xml:space="preserve">, using brief alliance and outcome measures each session, lets the therapist catch a weakening bond and repair it, which is itself linked to better results. </w:t>
       </w:r>
       <w:r>
         <w:rPr>
@@ -2809,7 +4642,16 @@
         <w:pStyle w:val="ListBullet"/>
       </w:pPr>
       <w:r>
-        <w:t xml:space="preserve">The clinical message is that measuring the alliance is **not academic**, since a low early score is a cue to slow down, invite feedback and repair the relationship before pressing on with technique. </w:t>
+        <w:t xml:space="preserve">The clinical message is that measuring the alliance is </w:t>
+      </w:r>
+      <w:r>
+        <w:rPr>
+          <w:b/>
+        </w:rPr>
+        <w:t>not academic</w:t>
+      </w:r>
+      <w:r>
+        <w:t xml:space="preserve">, since a low early score is a cue to slow down, invite feedback and repair the relationship before pressing on with technique. </w:t>
       </w:r>
       <w:r>
         <w:rPr>
@@ -2824,7 +4666,25 @@
         <w:pStyle w:val="ListBullet"/>
       </w:pPr>
       <w:r>
-        <w:t xml:space="preserve">Because the correlation is **modest in size but highly consistent**, the alliance is best read as a **necessary foundation** that works together with effective technique rather than a guarantee of success on its own. </w:t>
+        <w:t xml:space="preserve">Because the correlation is </w:t>
+      </w:r>
+      <w:r>
+        <w:rPr>
+          <w:b/>
+        </w:rPr>
+        <w:t>modest in size but highly consistent</w:t>
+      </w:r>
+      <w:r>
+        <w:t xml:space="preserve">, the alliance is best read as a </w:t>
+      </w:r>
+      <w:r>
+        <w:rPr>
+          <w:b/>
+        </w:rPr>
+        <w:t>necessary foundation</w:t>
+      </w:r>
+      <w:r>
+        <w:t xml:space="preserve"> that works together with effective technique rather than a guarantee of success on its own. </w:t>
       </w:r>
       <w:r>
         <w:rPr>
@@ -2845,7 +4705,16 @@
         <w:t xml:space="preserve">Theoretical view: </w:t>
       </w:r>
       <w:r>
-        <w:t xml:space="preserve"> The convergence of **Bordin's model, the WAI and the meta-analytic evidence** gives the alliance a rare status in psychotherapy, as a concept that is at once theoretically clear, measurable and empirically supported. </w:t>
+        <w:t xml:space="preserve"> The convergence of </w:t>
+      </w:r>
+      <w:r>
+        <w:rPr>
+          <w:b/>
+        </w:rPr>
+        <w:t>Bordin's model, the WAI and the meta-analytic evidence</w:t>
+      </w:r>
+      <w:r>
+        <w:t xml:space="preserve"> gives the alliance a rare status in psychotherapy, as a concept that is at once theoretically clear, measurable and empirically supported. </w:t>
       </w:r>
       <w:r>
         <w:rPr>
@@ -2853,6 +4722,87 @@
           <w:color w:val="555555"/>
         </w:rPr>
         <w:t>[APA Div 29 Norcross]</w:t>
+      </w:r>
+    </w:p>
+    <w:p>
+      <w:pPr>
+        <w:pStyle w:val="ListBullet"/>
+      </w:pPr>
+      <w:r>
+        <w:t xml:space="preserve">A practical strength of the brief measures is their </w:t>
+      </w:r>
+      <w:r>
+        <w:rPr>
+          <w:b/>
+        </w:rPr>
+        <w:t>low burden</w:t>
+      </w:r>
+      <w:r>
+        <w:t xml:space="preserve">, since scales such as the </w:t>
+      </w:r>
+      <w:r>
+        <w:rPr>
+          <w:b/>
+        </w:rPr>
+        <w:t>Session Rating Scale</w:t>
+      </w:r>
+      <w:r>
+        <w:t xml:space="preserve"> take under a minute, which makes session-by-session </w:t>
+      </w:r>
+      <w:r>
+        <w:t xml:space="preserve">alliance monitoring </w:t>
+      </w:r>
+      <w:r>
+        <w:rPr>
+          <w:i/>
+        </w:rPr>
+        <w:t>(routinely tracking the bond across sessions)</w:t>
+      </w:r>
+      <w:r>
+        <w:t xml:space="preserve"> feasible in busy clinical settings. </w:t>
+      </w:r>
+      <w:r>
+        <w:rPr>
+          <w:i/>
+          <w:color w:val="555555"/>
+        </w:rPr>
+        <w:t>[Corsini]</w:t>
+      </w:r>
+    </w:p>
+    <w:p>
+      <w:pPr>
+        <w:pStyle w:val="ListBullet"/>
+      </w:pPr>
+      <w:r>
+        <w:t xml:space="preserve">The evidence also warns against </w:t>
+      </w:r>
+      <w:r>
+        <w:rPr>
+          <w:b/>
+        </w:rPr>
+        <w:t>complacency</w:t>
+      </w:r>
+      <w:r>
+        <w:t xml:space="preserve">, because an alliance that looks strong can still mask an unspoken </w:t>
+      </w:r>
+      <w:r>
+        <w:t xml:space="preserve">rupture </w:t>
+      </w:r>
+      <w:r>
+        <w:rPr>
+          <w:i/>
+        </w:rPr>
+        <w:t>(a strain or breakdown in the bond)</w:t>
+      </w:r>
+      <w:r>
+        <w:t xml:space="preserve">, so therapists are urged to invite honest feedback rather than assume a high score settles the matter. </w:t>
+      </w:r>
+      <w:r>
+        <w:rPr>
+          <w:i/>
+          <w:color w:val="555555"/>
+        </w:rPr>
+        <w:t>[Corsini]</w:t>
       </w:r>
     </w:p>
     <w:p>

</xml_diff>

<commit_message>
Expand book citations to full author and title in Psychotherapy Unit II DOCX
</commit_message>
<xml_diff>
--- a/Psychotherapy_Unit_II_Comprehensive_Notes.docx
+++ b/Psychotherapy_Unit_II_Comprehensive_Notes.docx
@@ -312,7 +312,7 @@
           <w:i/>
           <w:color w:val="555555"/>
         </w:rPr>
-        <w:t>[Gabbard]</w:t>
+        <w:t>[Glen O. Gabbard, Long-Term Psychodynamic Psychotherapy: A Basic Text]</w:t>
       </w:r>
       <w:r>
         <w:t xml:space="preserve"> or </w:t>
@@ -322,7 +322,7 @@
           <w:i/>
           <w:color w:val="555555"/>
         </w:rPr>
-        <w:t>[Corey]</w:t>
+        <w:t>[Gerald Corey, Theory and Practice of Counseling and Psychotherapy]</w:t>
       </w:r>
       <w:r>
         <w:t>, so you can trace any claim back to the work it comes from.</w:t>
@@ -340,7 +340,7 @@
           <w:i/>
           <w:color w:val="555555"/>
         </w:rPr>
-        <w:t>[APA 2017]</w:t>
+        <w:t>[American Psychological Association, Ethics Code 2017]</w:t>
       </w:r>
       <w:r>
         <w:t>, keeping any section number.</w:t>
@@ -522,7 +522,7 @@
                 <w:i/>
                 <w:color w:val="555555"/>
               </w:rPr>
-              <w:t>[APA Dictionary of Psychology]</w:t>
+              <w:t>[American Psychological Association, APA Dictionary of Psychology]</w:t>
             </w:r>
           </w:p>
           <w:p>
@@ -570,7 +570,7 @@
                 <w:i/>
                 <w:color w:val="555555"/>
               </w:rPr>
-              <w:t>[WHO mhGAP]</w:t>
+              <w:t>[World Health Organization, mhGAP Intervention Guide]</w:t>
             </w:r>
           </w:p>
           <w:p>
@@ -618,7 +618,7 @@
                 <w:i/>
                 <w:color w:val="555555"/>
               </w:rPr>
-              <w:t>[Gabbard]</w:t>
+              <w:t>[Glen O. Gabbard, Long-Term Psychodynamic Psychotherapy: A Basic Text]</w:t>
             </w:r>
           </w:p>
           <w:p>
@@ -666,7 +666,7 @@
                 <w:i/>
                 <w:color w:val="555555"/>
               </w:rPr>
-              <w:t>[Corsini]</w:t>
+              <w:t>[Raymond J. Corsini &amp; Danny Wedding, Current Psychotherapies]</w:t>
             </w:r>
           </w:p>
         </w:tc>
@@ -714,7 +714,7 @@
           <w:i/>
           <w:color w:val="555555"/>
         </w:rPr>
-        <w:t>[Gabbard]</w:t>
+        <w:t>[Glen O. Gabbard, Long-Term Psychodynamic Psychotherapy: A Basic Text]</w:t>
       </w:r>
     </w:p>
     <w:p>
@@ -753,7 +753,7 @@
           <w:i/>
           <w:color w:val="555555"/>
         </w:rPr>
-        <w:t>[Sharf]</w:t>
+        <w:t>[Richard S. Sharf, Theories of Psychotherapy and Counseling]</w:t>
       </w:r>
     </w:p>
     <w:p>
@@ -792,7 +792,7 @@
           <w:i/>
           <w:color w:val="555555"/>
         </w:rPr>
-        <w:t>[Corey]</w:t>
+        <w:t>[Gerald Corey, Theory and Practice of Counseling and Psychotherapy]</w:t>
       </w:r>
     </w:p>
     <w:p>
@@ -816,7 +816,7 @@
           <w:i/>
           <w:color w:val="555555"/>
         </w:rPr>
-        <w:t>[Corsini]</w:t>
+        <w:t>[Raymond J. Corsini &amp; Danny Wedding, Current Psychotherapies]</w:t>
       </w:r>
     </w:p>
     <w:p>
@@ -840,7 +840,7 @@
           <w:i/>
           <w:color w:val="555555"/>
         </w:rPr>
-        <w:t>[Lister-Ford]</w:t>
+        <w:t>[Christine Lister-Ford, A Short Introduction to Psychotherapy]</w:t>
       </w:r>
     </w:p>
     <w:p>
@@ -914,7 +914,7 @@
           <w:i/>
           <w:color w:val="555555"/>
         </w:rPr>
-        <w:t>[Corsini]</w:t>
+        <w:t>[Raymond J. Corsini &amp; Danny Wedding, Current Psychotherapies]</w:t>
       </w:r>
     </w:p>
     <w:p>
@@ -956,7 +956,7 @@
           <w:i/>
           <w:color w:val="555555"/>
         </w:rPr>
-        <w:t>[Corsini]</w:t>
+        <w:t>[Raymond J. Corsini &amp; Danny Wedding, Current Psychotherapies]</w:t>
       </w:r>
     </w:p>
     <w:p>
@@ -1031,7 +1031,7 @@
           <w:i/>
           <w:color w:val="555555"/>
         </w:rPr>
-        <w:t>[Sharf]</w:t>
+        <w:t>[Richard S. Sharf, Theories of Psychotherapy and Counseling]</w:t>
       </w:r>
     </w:p>
     <w:p>
@@ -1055,7 +1055,7 @@
           <w:i/>
           <w:color w:val="555555"/>
         </w:rPr>
-        <w:t>[Corey]</w:t>
+        <w:t>[Gerald Corey, Theory and Practice of Counseling and Psychotherapy]</w:t>
       </w:r>
     </w:p>
     <w:p>
@@ -1112,7 +1112,7 @@
           <w:i/>
           <w:color w:val="555555"/>
         </w:rPr>
-        <w:t>[Gabbard]</w:t>
+        <w:t>[Glen O. Gabbard, Long-Term Psychodynamic Psychotherapy: A Basic Text]</w:t>
       </w:r>
     </w:p>
     <w:p>
@@ -1178,7 +1178,7 @@
           <w:i/>
           <w:color w:val="555555"/>
         </w:rPr>
-        <w:t>[Gabbard]</w:t>
+        <w:t>[Glen O. Gabbard, Long-Term Psychodynamic Psychotherapy: A Basic Text]</w:t>
       </w:r>
     </w:p>
     <w:p>
@@ -1229,7 +1229,7 @@
           <w:i/>
           <w:color w:val="555555"/>
         </w:rPr>
-        <w:t>[Gabbard]</w:t>
+        <w:t>[Glen O. Gabbard, Long-Term Psychodynamic Psychotherapy: A Basic Text]</w:t>
       </w:r>
     </w:p>
     <w:p>
@@ -1253,7 +1253,7 @@
           <w:i/>
           <w:color w:val="555555"/>
         </w:rPr>
-        <w:t>[Gabbard]</w:t>
+        <w:t>[Glen O. Gabbard, Long-Term Psychodynamic Psychotherapy: A Basic Text]</w:t>
       </w:r>
     </w:p>
     <w:p>
@@ -1295,7 +1295,7 @@
           <w:i/>
           <w:color w:val="555555"/>
         </w:rPr>
-        <w:t>[Gabbard]</w:t>
+        <w:t>[Glen O. Gabbard, Long-Term Psychodynamic Psychotherapy: A Basic Text]</w:t>
       </w:r>
     </w:p>
     <w:p>
@@ -1319,7 +1319,7 @@
           <w:i/>
           <w:color w:val="555555"/>
         </w:rPr>
-        <w:t>[Gabbard]</w:t>
+        <w:t>[Glen O. Gabbard, Long-Term Psychodynamic Psychotherapy: A Basic Text]</w:t>
       </w:r>
     </w:p>
     <w:p>
@@ -1361,7 +1361,7 @@
           <w:i/>
           <w:color w:val="555555"/>
         </w:rPr>
-        <w:t>[Lister-Ford]</w:t>
+        <w:t>[Christine Lister-Ford, A Short Introduction to Psychotherapy]</w:t>
       </w:r>
     </w:p>
     <w:tbl>
@@ -1519,7 +1519,7 @@
           <w:i/>
           <w:color w:val="555555"/>
         </w:rPr>
-        <w:t>[Corsini]</w:t>
+        <w:t>[Raymond J. Corsini &amp; Danny Wedding, Current Psychotherapies]</w:t>
       </w:r>
     </w:p>
     <w:p>
@@ -1552,7 +1552,7 @@
           <w:i/>
           <w:color w:val="555555"/>
         </w:rPr>
-        <w:t>[Corsini]</w:t>
+        <w:t>[Raymond J. Corsini &amp; Danny Wedding, Current Psychotherapies]</w:t>
       </w:r>
     </w:p>
     <w:p>
@@ -1585,7 +1585,7 @@
           <w:i/>
           <w:color w:val="555555"/>
         </w:rPr>
-        <w:t>[Corsini]</w:t>
+        <w:t>[Raymond J. Corsini &amp; Danny Wedding, Current Psychotherapies]</w:t>
       </w:r>
     </w:p>
     <w:p>
@@ -1615,7 +1615,7 @@
           <w:i/>
           <w:color w:val="555555"/>
         </w:rPr>
-        <w:t>[Gabbard]</w:t>
+        <w:t>[Glen O. Gabbard, Long-Term Psychodynamic Psychotherapy: A Basic Text]</w:t>
       </w:r>
     </w:p>
     <w:p>
@@ -1672,7 +1672,7 @@
           <w:i/>
           <w:color w:val="555555"/>
         </w:rPr>
-        <w:t>[Gabbard]</w:t>
+        <w:t>[Glen O. Gabbard, Long-Term Psychodynamic Psychotherapy: A Basic Text]</w:t>
       </w:r>
     </w:p>
     <w:p>
@@ -1720,7 +1720,7 @@
           <w:i/>
           <w:color w:val="555555"/>
         </w:rPr>
-        <w:t>[Corsini]</w:t>
+        <w:t>[Raymond J. Corsini &amp; Danny Wedding, Current Psychotherapies]</w:t>
       </w:r>
     </w:p>
     <w:p>
@@ -1780,7 +1780,7 @@
           <w:i/>
           <w:color w:val="555555"/>
         </w:rPr>
-        <w:t>[Corsini]</w:t>
+        <w:t>[Raymond J. Corsini &amp; Danny Wedding, Current Psychotherapies]</w:t>
       </w:r>
     </w:p>
     <w:p>
@@ -1813,7 +1813,7 @@
           <w:i/>
           <w:color w:val="555555"/>
         </w:rPr>
-        <w:t>[Sharf]</w:t>
+        <w:t>[Richard S. Sharf, Theories of Psychotherapy and Counseling]</w:t>
       </w:r>
     </w:p>
     <w:p>
@@ -1855,7 +1855,7 @@
           <w:i/>
           <w:color w:val="555555"/>
         </w:rPr>
-        <w:t>[Sharf]</w:t>
+        <w:t>[Richard S. Sharf, Theories of Psychotherapy and Counseling]</w:t>
       </w:r>
     </w:p>
     <w:p>
@@ -1885,7 +1885,7 @@
           <w:i/>
           <w:color w:val="555555"/>
         </w:rPr>
-        <w:t>[Corey]</w:t>
+        <w:t>[Gerald Corey, Theory and Practice of Counseling and Psychotherapy]</w:t>
       </w:r>
     </w:p>
     <w:p>
@@ -1927,7 +1927,7 @@
           <w:i/>
           <w:color w:val="555555"/>
         </w:rPr>
-        <w:t>[Corey]</w:t>
+        <w:t>[Gerald Corey, Theory and Practice of Counseling and Psychotherapy]</w:t>
       </w:r>
     </w:p>
     <w:p>
@@ -1957,7 +1957,7 @@
           <w:i/>
           <w:color w:val="555555"/>
         </w:rPr>
-        <w:t>[Gabbard]</w:t>
+        <w:t>[Glen O. Gabbard, Long-Term Psychodynamic Psychotherapy: A Basic Text]</w:t>
       </w:r>
     </w:p>
     <w:p>
@@ -1981,7 +1981,7 @@
           <w:i/>
           <w:color w:val="555555"/>
         </w:rPr>
-        <w:t>[Lister-Ford]</w:t>
+        <w:t>[Christine Lister-Ford, A Short Introduction to Psychotherapy]</w:t>
       </w:r>
     </w:p>
     <w:p>
@@ -2023,7 +2023,7 @@
           <w:i/>
           <w:color w:val="555555"/>
         </w:rPr>
-        <w:t>[Corey]</w:t>
+        <w:t>[Gerald Corey, Theory and Practice of Counseling and Psychotherapy]</w:t>
       </w:r>
     </w:p>
     <w:p>
@@ -2047,7 +2047,7 @@
           <w:i/>
           <w:color w:val="555555"/>
         </w:rPr>
-        <w:t>[Lister-Ford]</w:t>
+        <w:t>[Christine Lister-Ford, A Short Introduction to Psychotherapy]</w:t>
       </w:r>
     </w:p>
     <w:p>
@@ -2127,7 +2127,7 @@
           <w:i/>
           <w:color w:val="555555"/>
         </w:rPr>
-        <w:t>[Corey]</w:t>
+        <w:t>[Gerald Corey, Theory and Practice of Counseling and Psychotherapy]</w:t>
       </w:r>
     </w:p>
     <w:p>
@@ -2148,7 +2148,7 @@
           <w:i/>
           <w:color w:val="555555"/>
         </w:rPr>
-        <w:t>[Corey]</w:t>
+        <w:t>[Gerald Corey, Theory and Practice of Counseling and Psychotherapy]</w:t>
       </w:r>
     </w:p>
     <w:p>
@@ -2178,7 +2178,7 @@
           <w:i/>
           <w:color w:val="555555"/>
         </w:rPr>
-        <w:t>[Gabbard]</w:t>
+        <w:t>[Glen O. Gabbard, Long-Term Psychodynamic Psychotherapy: A Basic Text]</w:t>
       </w:r>
     </w:p>
     <w:p>
@@ -2202,7 +2202,7 @@
           <w:i/>
           <w:color w:val="555555"/>
         </w:rPr>
-        <w:t>[Corey]</w:t>
+        <w:t>[Gerald Corey, Theory and Practice of Counseling and Psychotherapy]</w:t>
       </w:r>
     </w:p>
     <w:p>
@@ -2250,7 +2250,7 @@
           <w:i/>
           <w:color w:val="555555"/>
         </w:rPr>
-        <w:t>[Corsini]</w:t>
+        <w:t>[Raymond J. Corsini &amp; Danny Wedding, Current Psychotherapies]</w:t>
       </w:r>
     </w:p>
     <w:p>
@@ -2280,7 +2280,7 @@
           <w:i/>
           <w:color w:val="555555"/>
         </w:rPr>
-        <w:t>[Sharf]</w:t>
+        <w:t>[Richard S. Sharf, Theories of Psychotherapy and Counseling]</w:t>
       </w:r>
     </w:p>
     <w:p>
@@ -2313,7 +2313,7 @@
           <w:i/>
           <w:color w:val="555555"/>
         </w:rPr>
-        <w:t>[Gabbard]</w:t>
+        <w:t>[Glen O. Gabbard, Long-Term Psychodynamic Psychotherapy: A Basic Text]</w:t>
       </w:r>
     </w:p>
     <w:p>
@@ -2343,7 +2343,7 @@
           <w:i/>
           <w:color w:val="555555"/>
         </w:rPr>
-        <w:t>[Gabbard]</w:t>
+        <w:t>[Glen O. Gabbard, Long-Term Psychodynamic Psychotherapy: A Basic Text]</w:t>
       </w:r>
     </w:p>
     <w:p>
@@ -2364,7 +2364,7 @@
           <w:i/>
           <w:color w:val="555555"/>
         </w:rPr>
-        <w:t>[Gabbard]</w:t>
+        <w:t>[Glen O. Gabbard, Long-Term Psychodynamic Psychotherapy: A Basic Text]</w:t>
       </w:r>
     </w:p>
     <w:p>
@@ -2397,7 +2397,7 @@
           <w:i/>
           <w:color w:val="555555"/>
         </w:rPr>
-        <w:t>[Corsini]</w:t>
+        <w:t>[Raymond J. Corsini &amp; Danny Wedding, Current Psychotherapies]</w:t>
       </w:r>
     </w:p>
     <w:p>
@@ -2427,7 +2427,7 @@
           <w:i/>
           <w:color w:val="555555"/>
         </w:rPr>
-        <w:t>[Corey]</w:t>
+        <w:t>[Gerald Corey, Theory and Practice of Counseling and Psychotherapy]</w:t>
       </w:r>
     </w:p>
     <w:p>
@@ -2466,7 +2466,7 @@
           <w:i/>
           <w:color w:val="555555"/>
         </w:rPr>
-        <w:t>[RCI Act 1992]</w:t>
+        <w:t>[Rehabilitation Council of India Act, 1992]</w:t>
       </w:r>
     </w:p>
     <w:p>
@@ -2487,7 +2487,7 @@
           <w:i/>
           <w:color w:val="555555"/>
         </w:rPr>
-        <w:t>[Corey]</w:t>
+        <w:t>[Gerald Corey, Theory and Practice of Counseling and Psychotherapy]</w:t>
       </w:r>
     </w:p>
     <w:p>
@@ -2508,7 +2508,7 @@
           <w:i/>
           <w:color w:val="555555"/>
         </w:rPr>
-        <w:t>[Corey]</w:t>
+        <w:t>[Gerald Corey, Theory and Practice of Counseling and Psychotherapy]</w:t>
       </w:r>
     </w:p>
     <w:p>
@@ -2532,7 +2532,7 @@
           <w:i/>
           <w:color w:val="555555"/>
         </w:rPr>
-        <w:t>[Corsini]</w:t>
+        <w:t>[Raymond J. Corsini &amp; Danny Wedding, Current Psychotherapies]</w:t>
       </w:r>
     </w:p>
     <w:p>
@@ -2621,7 +2621,7 @@
           <w:i/>
           <w:color w:val="555555"/>
         </w:rPr>
-        <w:t>[Gabbard]</w:t>
+        <w:t>[Glen O. Gabbard, Long-Term Psychodynamic Psychotherapy: A Basic Text]</w:t>
       </w:r>
     </w:p>
     <w:p>
@@ -2651,7 +2651,7 @@
           <w:i/>
           <w:color w:val="555555"/>
         </w:rPr>
-        <w:t>[Gabbard]</w:t>
+        <w:t>[Glen O. Gabbard, Long-Term Psychodynamic Psychotherapy: A Basic Text]</w:t>
       </w:r>
     </w:p>
     <w:p>
@@ -2681,7 +2681,7 @@
           <w:i/>
           <w:color w:val="555555"/>
         </w:rPr>
-        <w:t>[Gabbard]</w:t>
+        <w:t>[Glen O. Gabbard, Long-Term Psychodynamic Psychotherapy: A Basic Text]</w:t>
       </w:r>
     </w:p>
     <w:p>
@@ -2711,7 +2711,7 @@
           <w:i/>
           <w:color w:val="555555"/>
         </w:rPr>
-        <w:t>[Gabbard]</w:t>
+        <w:t>[Glen O. Gabbard, Long-Term Psychodynamic Psychotherapy: A Basic Text]</w:t>
       </w:r>
     </w:p>
     <w:p>
@@ -2750,7 +2750,7 @@
           <w:i/>
           <w:color w:val="555555"/>
         </w:rPr>
-        <w:t>[Corsini]</w:t>
+        <w:t>[Raymond J. Corsini &amp; Danny Wedding, Current Psychotherapies]</w:t>
       </w:r>
     </w:p>
     <w:p>
@@ -2780,7 +2780,7 @@
           <w:i/>
           <w:color w:val="555555"/>
         </w:rPr>
-        <w:t>[Gabbard]</w:t>
+        <w:t>[Glen O. Gabbard, Long-Term Psychodynamic Psychotherapy: A Basic Text]</w:t>
       </w:r>
     </w:p>
     <w:p>
@@ -2804,7 +2804,7 @@
           <w:i/>
           <w:color w:val="555555"/>
         </w:rPr>
-        <w:t>[Gabbard]</w:t>
+        <w:t>[Glen O. Gabbard, Long-Term Psychodynamic Psychotherapy: A Basic Text]</w:t>
       </w:r>
     </w:p>
     <w:p>
@@ -2825,7 +2825,7 @@
           <w:i/>
           <w:color w:val="555555"/>
         </w:rPr>
-        <w:t>[Gabbard]</w:t>
+        <w:t>[Glen O. Gabbard, Long-Term Psychodynamic Psychotherapy: A Basic Text]</w:t>
       </w:r>
     </w:p>
     <w:p>
@@ -2855,7 +2855,7 @@
           <w:i/>
           <w:color w:val="555555"/>
         </w:rPr>
-        <w:t>[Corey]</w:t>
+        <w:t>[Gerald Corey, Theory and Practice of Counseling and Psychotherapy]</w:t>
       </w:r>
     </w:p>
     <w:p>
@@ -2885,7 +2885,7 @@
           <w:i/>
           <w:color w:val="555555"/>
         </w:rPr>
-        <w:t>[APA 2017, Std 4.05]</w:t>
+        <w:t>[American Psychological Association, Ethics Code 2017, Std 4.05]</w:t>
       </w:r>
     </w:p>
     <w:p>
@@ -2918,7 +2918,7 @@
           <w:i/>
           <w:color w:val="555555"/>
         </w:rPr>
-        <w:t>[Gabbard]</w:t>
+        <w:t>[Glen O. Gabbard, Long-Term Psychodynamic Psychotherapy: A Basic Text]</w:t>
       </w:r>
     </w:p>
     <w:p>
@@ -2948,7 +2948,7 @@
           <w:i/>
           <w:color w:val="555555"/>
         </w:rPr>
-        <w:t>[Gabbard]</w:t>
+        <w:t>[Glen O. Gabbard, Long-Term Psychodynamic Psychotherapy: A Basic Text]</w:t>
       </w:r>
     </w:p>
     <w:p>
@@ -2969,7 +2969,7 @@
           <w:i/>
           <w:color w:val="555555"/>
         </w:rPr>
-        <w:t>[Gabbard]</w:t>
+        <w:t>[Glen O. Gabbard, Long-Term Psychodynamic Psychotherapy: A Basic Text]</w:t>
       </w:r>
     </w:p>
     <w:p>
@@ -3002,7 +3002,7 @@
           <w:i/>
           <w:color w:val="555555"/>
         </w:rPr>
-        <w:t>[Gabbard]</w:t>
+        <w:t>[Glen O. Gabbard, Long-Term Psychodynamic Psychotherapy: A Basic Text]</w:t>
       </w:r>
     </w:p>
     <w:p>
@@ -3115,7 +3115,7 @@
           <w:i/>
           <w:color w:val="555555"/>
         </w:rPr>
-        <w:t>[Corsini]</w:t>
+        <w:t>[Raymond J. Corsini &amp; Danny Wedding, Current Psychotherapies]</w:t>
       </w:r>
     </w:p>
     <w:p>
@@ -3166,7 +3166,7 @@
           <w:i/>
           <w:color w:val="555555"/>
         </w:rPr>
-        <w:t>[Corsini]</w:t>
+        <w:t>[Raymond J. Corsini &amp; Danny Wedding, Current Psychotherapies]</w:t>
       </w:r>
     </w:p>
     <w:p>
@@ -3199,7 +3199,7 @@
           <w:i/>
           <w:color w:val="555555"/>
         </w:rPr>
-        <w:t>[Corsini]</w:t>
+        <w:t>[Raymond J. Corsini &amp; Danny Wedding, Current Psychotherapies]</w:t>
       </w:r>
     </w:p>
     <w:p>
@@ -3232,7 +3232,7 @@
           <w:i/>
           <w:color w:val="555555"/>
         </w:rPr>
-        <w:t>[Gabbard]</w:t>
+        <w:t>[Glen O. Gabbard, Long-Term Psychodynamic Psychotherapy: A Basic Text]</w:t>
       </w:r>
     </w:p>
     <w:p>
@@ -3265,7 +3265,7 @@
           <w:i/>
           <w:color w:val="555555"/>
         </w:rPr>
-        <w:t>[Gabbard]</w:t>
+        <w:t>[Glen O. Gabbard, Long-Term Psychodynamic Psychotherapy: A Basic Text]</w:t>
       </w:r>
     </w:p>
     <w:p>
@@ -3307,7 +3307,7 @@
           <w:i/>
           <w:color w:val="555555"/>
         </w:rPr>
-        <w:t>[Sharf]</w:t>
+        <w:t>[Richard S. Sharf, Theories of Psychotherapy and Counseling]</w:t>
       </w:r>
     </w:p>
     <w:p>
@@ -3337,7 +3337,7 @@
           <w:i/>
           <w:color w:val="555555"/>
         </w:rPr>
-        <w:t>[Corey]</w:t>
+        <w:t>[Gerald Corey, Theory and Practice of Counseling and Psychotherapy]</w:t>
       </w:r>
     </w:p>
     <w:p>
@@ -3370,7 +3370,7 @@
           <w:i/>
           <w:color w:val="555555"/>
         </w:rPr>
-        <w:t>[Corsini]</w:t>
+        <w:t>[Raymond J. Corsini &amp; Danny Wedding, Current Psychotherapies]</w:t>
       </w:r>
     </w:p>
     <w:p>
@@ -3400,7 +3400,7 @@
           <w:i/>
           <w:color w:val="555555"/>
         </w:rPr>
-        <w:t>[Beck]</w:t>
+        <w:t>[Judith S. Beck, Cognitive Behavior Therapy: Basics and Beyond]</w:t>
       </w:r>
     </w:p>
     <w:p>
@@ -3424,7 +3424,7 @@
           <w:i/>
           <w:color w:val="555555"/>
         </w:rPr>
-        <w:t>[Corey]</w:t>
+        <w:t>[Gerald Corey, Theory and Practice of Counseling and Psychotherapy]</w:t>
       </w:r>
     </w:p>
     <w:p>
@@ -3463,7 +3463,7 @@
           <w:i/>
           <w:color w:val="555555"/>
         </w:rPr>
-        <w:t>[Corey]</w:t>
+        <w:t>[Gerald Corey, Theory and Practice of Counseling and Psychotherapy]</w:t>
       </w:r>
     </w:p>
     <w:p>
@@ -3493,7 +3493,7 @@
           <w:i/>
           <w:color w:val="555555"/>
         </w:rPr>
-        <w:t>[Corsini]</w:t>
+        <w:t>[Raymond J. Corsini &amp; Danny Wedding, Current Psychotherapies]</w:t>
       </w:r>
     </w:p>
     <w:p>
@@ -3526,7 +3526,7 @@
           <w:i/>
           <w:color w:val="555555"/>
         </w:rPr>
-        <w:t>[Corsini]</w:t>
+        <w:t>[Raymond J. Corsini &amp; Danny Wedding, Current Psychotherapies]</w:t>
       </w:r>
     </w:p>
     <w:p>
@@ -3605,7 +3605,7 @@
           <w:i/>
           <w:color w:val="555555"/>
         </w:rPr>
-        <w:t>[Lister-Ford]</w:t>
+        <w:t>[Christine Lister-Ford, A Short Introduction to Psychotherapy]</w:t>
       </w:r>
     </w:p>
     <w:p>
@@ -3635,7 +3635,7 @@
           <w:i/>
           <w:color w:val="555555"/>
         </w:rPr>
-        <w:t>[Gabbard]</w:t>
+        <w:t>[Glen O. Gabbard, Long-Term Psychodynamic Psychotherapy: A Basic Text]</w:t>
       </w:r>
     </w:p>
     <w:p>
@@ -3674,7 +3674,7 @@
           <w:i/>
           <w:color w:val="555555"/>
         </w:rPr>
-        <w:t>[Corey]</w:t>
+        <w:t>[Gerald Corey, Theory and Practice of Counseling and Psychotherapy]</w:t>
       </w:r>
     </w:p>
     <w:p>
@@ -3695,7 +3695,7 @@
           <w:i/>
           <w:color w:val="555555"/>
         </w:rPr>
-        <w:t>[Corey]</w:t>
+        <w:t>[Gerald Corey, Theory and Practice of Counseling and Psychotherapy]</w:t>
       </w:r>
     </w:p>
     <w:p>
@@ -3725,7 +3725,7 @@
           <w:i/>
           <w:color w:val="555555"/>
         </w:rPr>
-        <w:t>[Corey]</w:t>
+        <w:t>[Gerald Corey, Theory and Practice of Counseling and Psychotherapy]</w:t>
       </w:r>
     </w:p>
     <w:p>
@@ -3764,7 +3764,7 @@
           <w:i/>
           <w:color w:val="555555"/>
         </w:rPr>
-        <w:t>[Corsini]</w:t>
+        <w:t>[Raymond J. Corsini &amp; Danny Wedding, Current Psychotherapies]</w:t>
       </w:r>
     </w:p>
     <w:p>
@@ -3832,7 +3832,7 @@
           <w:i/>
           <w:color w:val="555555"/>
         </w:rPr>
-        <w:t>[Corsini]</w:t>
+        <w:t>[Raymond J. Corsini &amp; Danny Wedding, Current Psychotherapies]</w:t>
       </w:r>
     </w:p>
     <w:p>
@@ -3874,7 +3874,7 @@
           <w:i/>
           <w:color w:val="555555"/>
         </w:rPr>
-        <w:t>[Corsini]</w:t>
+        <w:t>[Raymond J. Corsini &amp; Danny Wedding, Current Psychotherapies]</w:t>
       </w:r>
     </w:p>
     <w:p>
@@ -3898,7 +3898,7 @@
           <w:i/>
           <w:color w:val="555555"/>
         </w:rPr>
-        <w:t>[Gabbard]</w:t>
+        <w:t>[Glen O. Gabbard, Long-Term Psychodynamic Psychotherapy: A Basic Text]</w:t>
       </w:r>
     </w:p>
     <w:p>
@@ -3922,7 +3922,7 @@
           <w:i/>
           <w:color w:val="555555"/>
         </w:rPr>
-        <w:t>[Gabbard]</w:t>
+        <w:t>[Glen O. Gabbard, Long-Term Psychodynamic Psychotherapy: A Basic Text]</w:t>
       </w:r>
     </w:p>
     <w:tbl>
@@ -4014,7 +4014,7 @@
           <w:i/>
           <w:color w:val="555555"/>
         </w:rPr>
-        <w:t>[Gabbard]</w:t>
+        <w:t>[Glen O. Gabbard, Long-Term Psychodynamic Psychotherapy: A Basic Text]</w:t>
       </w:r>
     </w:p>
     <w:p>
@@ -4053,7 +4053,7 @@
           <w:i/>
           <w:color w:val="555555"/>
         </w:rPr>
-        <w:t>[APA 2017, Std 3.05]</w:t>
+        <w:t>[American Psychological Association, Ethics Code 2017, Std 3.05]</w:t>
       </w:r>
     </w:p>
     <w:p>
@@ -4092,7 +4092,7 @@
           <w:i/>
           <w:color w:val="555555"/>
         </w:rPr>
-        <w:t>[APA 2017, Std 10.05]</w:t>
+        <w:t>[American Psychological Association, Ethics Code 2017, Std 10.05]</w:t>
       </w:r>
     </w:p>
     <w:p>
@@ -4131,7 +4131,7 @@
           <w:i/>
           <w:color w:val="555555"/>
         </w:rPr>
-        <w:t>[RCI Act 1992]</w:t>
+        <w:t>[Rehabilitation Council of India Act, 1992]</w:t>
       </w:r>
     </w:p>
     <w:p>
@@ -4170,7 +4170,7 @@
           <w:i/>
           <w:color w:val="555555"/>
         </w:rPr>
-        <w:t>[WHO mhGAP]</w:t>
+        <w:t>[World Health Organization, mhGAP Intervention Guide]</w:t>
       </w:r>
     </w:p>
     <w:p>
@@ -4209,7 +4209,7 @@
           <w:i/>
           <w:color w:val="555555"/>
         </w:rPr>
-        <w:t>[IACP]</w:t>
+        <w:t>[Indian Association of Clinical Psychologists (secondary summary only)]</w:t>
       </w:r>
     </w:p>
     <w:p>
@@ -4230,7 +4230,7 @@
           <w:i/>
           <w:color w:val="555555"/>
         </w:rPr>
-        <w:t>[Corey]</w:t>
+        <w:t>[Gerald Corey, Theory and Practice of Counseling and Psychotherapy]</w:t>
       </w:r>
     </w:p>
     <w:p>
@@ -4328,7 +4328,7 @@
           <w:i/>
           <w:color w:val="555555"/>
         </w:rPr>
-        <w:t>[Corsini]</w:t>
+        <w:t>[Raymond J. Corsini &amp; Danny Wedding, Current Psychotherapies]</w:t>
       </w:r>
     </w:p>
     <w:p>
@@ -4361,7 +4361,7 @@
           <w:i/>
           <w:color w:val="555555"/>
         </w:rPr>
-        <w:t>[Corsini]</w:t>
+        <w:t>[Raymond J. Corsini &amp; Danny Wedding, Current Psychotherapies]</w:t>
       </w:r>
     </w:p>
     <w:p>
@@ -4418,7 +4418,7 @@
           <w:i/>
           <w:color w:val="555555"/>
         </w:rPr>
-        <w:t>[APA Div 29 Norcross]</w:t>
+        <w:t>[John C. Norcross (ed.), Psychotherapy Relationships That Work (APA Division 29 task force)]</w:t>
       </w:r>
     </w:p>
     <w:p>
@@ -4457,7 +4457,7 @@
           <w:i/>
           <w:color w:val="555555"/>
         </w:rPr>
-        <w:t>[APA Div 29 Norcross]</w:t>
+        <w:t>[John C. Norcross (ed.), Psychotherapy Relationships That Work (APA Division 29 task force)]</w:t>
       </w:r>
     </w:p>
     <w:p>
@@ -4481,7 +4481,7 @@
           <w:i/>
           <w:color w:val="555555"/>
         </w:rPr>
-        <w:t>[Corsini]</w:t>
+        <w:t>[Raymond J. Corsini &amp; Danny Wedding, Current Psychotherapies]</w:t>
       </w:r>
     </w:p>
     <w:p>
@@ -4514,7 +4514,7 @@
           <w:i/>
           <w:color w:val="555555"/>
         </w:rPr>
-        <w:t>[APA Div 29 Norcross]</w:t>
+        <w:t>[John C. Norcross (ed.), Psychotherapy Relationships That Work (APA Division 29 task force)]</w:t>
       </w:r>
     </w:p>
     <w:p>
@@ -4556,7 +4556,7 @@
           <w:i/>
           <w:color w:val="555555"/>
         </w:rPr>
-        <w:t>[Corsini]</w:t>
+        <w:t>[Raymond J. Corsini &amp; Danny Wedding, Current Psychotherapies]</w:t>
       </w:r>
     </w:p>
     <w:p>
@@ -4613,7 +4613,7 @@
           <w:i/>
           <w:color w:val="555555"/>
         </w:rPr>
-        <w:t>[APA Div 29 Norcross]</w:t>
+        <w:t>[John C. Norcross (ed.), Psychotherapy Relationships That Work (APA Division 29 task force)]</w:t>
       </w:r>
     </w:p>
     <w:p>
@@ -4634,7 +4634,7 @@
           <w:i/>
           <w:color w:val="555555"/>
         </w:rPr>
-        <w:t>[Corsini]</w:t>
+        <w:t>[Raymond J. Corsini &amp; Danny Wedding, Current Psychotherapies]</w:t>
       </w:r>
     </w:p>
     <w:p>
@@ -4658,7 +4658,7 @@
           <w:i/>
           <w:color w:val="555555"/>
         </w:rPr>
-        <w:t>[Corsini]</w:t>
+        <w:t>[Raymond J. Corsini &amp; Danny Wedding, Current Psychotherapies]</w:t>
       </w:r>
     </w:p>
     <w:p>
@@ -4691,7 +4691,7 @@
           <w:i/>
           <w:color w:val="555555"/>
         </w:rPr>
-        <w:t>[Corsini]</w:t>
+        <w:t>[Raymond J. Corsini &amp; Danny Wedding, Current Psychotherapies]</w:t>
       </w:r>
     </w:p>
     <w:p>
@@ -4721,7 +4721,7 @@
           <w:i/>
           <w:color w:val="555555"/>
         </w:rPr>
-        <w:t>[APA Div 29 Norcross]</w:t>
+        <w:t>[John C. Norcross (ed.), Psychotherapy Relationships That Work (APA Division 29 task force)]</w:t>
       </w:r>
     </w:p>
     <w:p>
@@ -4766,7 +4766,7 @@
           <w:i/>
           <w:color w:val="555555"/>
         </w:rPr>
-        <w:t>[Corsini]</w:t>
+        <w:t>[Raymond J. Corsini &amp; Danny Wedding, Current Psychotherapies]</w:t>
       </w:r>
     </w:p>
     <w:p>
@@ -4802,7 +4802,7 @@
           <w:i/>
           <w:color w:val="555555"/>
         </w:rPr>
-        <w:t>[Corsini]</w:t>
+        <w:t>[Raymond J. Corsini &amp; Danny Wedding, Current Psychotherapies]</w:t>
       </w:r>
     </w:p>
     <w:p>
@@ -4838,7 +4838,7 @@
           <w:color w:val="475569"/>
           <w:sz w:val="19"/>
         </w:rPr>
-        <w:t>[APA Div 29 Norcross]</w:t>
+        <w:t>[John C. Norcross (ed.), Psychotherapy Relationships That Work (APA Division 29 task force)]</w:t>
       </w:r>
     </w:p>
     <w:p>

</xml_diff>

<commit_message>
fix: top up Unit II t4/t5/t7 to 15+ glossed exam points
Add source-grounded ul points so every topic has >=15 main exam-form points (t4=16, t5=15, t7=15). Each new point is a full ~25-30 word sentence with 2-4 bold hooks, a valid CITES citation, and a [[term|gloss]] so hard terms render as 'term (gloss)' in both HTML and DOCX. Topics t1/t2/t3/t6 and all figures/mnemonics unchanged; Unit I untouched.
</commit_message>
<xml_diff>
--- a/Psychotherapy_Unit_II_Comprehensive_Notes.docx
+++ b/Psychotherapy_Unit_II_Comprehensive_Notes.docx
@@ -2977,25 +2977,37 @@
         <w:pStyle w:val="ListBullet"/>
       </w:pPr>
       <w:r>
-        <w:t xml:space="preserve">Across presentations the principle holds that the </w:t>
+        <w:t xml:space="preserve">In </w:t>
       </w:r>
       <w:r>
         <w:rPr>
           <w:b/>
         </w:rPr>
-        <w:t>sicker or more mistrustful</w:t>
-      </w:r>
-      <w:r>
-        <w:t xml:space="preserve"> the client, the more the therapist must </w:t>
+        <w:t>bipolar disorder</w:t>
+      </w:r>
+      <w:r>
+        <w:t xml:space="preserve">, the raised energy and grandiosity of </w:t>
+      </w:r>
+      <w:r>
+        <w:t xml:space="preserve">mania </w:t>
+      </w:r>
+      <w:r>
+        <w:rPr>
+          <w:i/>
+        </w:rPr>
+        <w:t>(an elevated, overactive mood state with reduced insight)</w:t>
+      </w:r>
+      <w:r>
+        <w:t xml:space="preserve"> can shrink </w:t>
       </w:r>
       <w:r>
         <w:rPr>
           <w:b/>
         </w:rPr>
-        <w:t>adjust pace, structure and activity</w:t>
-      </w:r>
-      <w:r>
-        <w:t xml:space="preserve"> to protect a fragile bond. </w:t>
+        <w:t>collaboration</w:t>
+      </w:r>
+      <w:r>
+        <w:t xml:space="preserve">, so the therapist waits for stability before attempting deeper work. </w:t>
       </w:r>
       <w:r>
         <w:rPr>
@@ -3006,38 +3018,116 @@
       </w:r>
     </w:p>
     <w:p>
+      <w:pPr>
+        <w:pStyle w:val="ListBullet"/>
+      </w:pPr>
+      <w:r>
+        <w:t xml:space="preserve">In </w:t>
+      </w:r>
       <w:r>
         <w:rPr>
           <w:b/>
         </w:rPr>
-        <w:t xml:space="preserve">Mnemonic — SICK-TM: </w:t>
-      </w:r>
-      <w:r>
-        <w:t>Severity and chronicity, Insight and motivation, Comorbidity, Kind of disorder, Trauma history, risk and Medication/physical illness — the illness factors that shape the alliance.</w:t>
+        <w:t>OCD and anxiety</w:t>
+      </w:r>
+      <w:r>
+        <w:t xml:space="preserve">, repeated </w:t>
+      </w:r>
+      <w:r>
+        <w:t xml:space="preserve">reassurance-seeking </w:t>
+      </w:r>
+      <w:r>
+        <w:rPr>
+          <w:i/>
+        </w:rPr>
+        <w:t>(asking the therapist again and again to confirm nothing is wrong)</w:t>
+      </w:r>
+      <w:r>
+        <w:t xml:space="preserve"> can pull the therapist into an </w:t>
+      </w:r>
+      <w:r>
+        <w:rPr>
+          <w:b/>
+        </w:rPr>
+        <w:t>unhelpful role</w:t>
+      </w:r>
+      <w:r>
+        <w:t xml:space="preserve"> that quietly feeds the very symptom. </w:t>
+      </w:r>
+      <w:r>
+        <w:rPr>
+          <w:i/>
+          <w:color w:val="555555"/>
+        </w:rPr>
+        <w:t>[Raymond J. Corsini &amp; Danny Wedding, Current Psychotherapies]</w:t>
       </w:r>
     </w:p>
     <w:p>
       <w:pPr>
-        <w:pStyle w:val="Heading1"/>
-      </w:pPr>
-      <w:r>
-        <w:t>5. How technique and therapeutic approach influence the relationship</w:t>
+        <w:pStyle w:val="ListBullet"/>
+      </w:pPr>
+      <w:r>
+        <w:t xml:space="preserve">Across presentations the principle holds that the </w:t>
+      </w:r>
+      <w:r>
+        <w:rPr>
+          <w:b/>
+        </w:rPr>
+        <w:t>sicker or more mistrustful</w:t>
+      </w:r>
+      <w:r>
+        <w:t xml:space="preserve"> the client, the more the therapist must </w:t>
+      </w:r>
+      <w:r>
+        <w:rPr>
+          <w:b/>
+        </w:rPr>
+        <w:t>adjust pace, structure and activity</w:t>
+      </w:r>
+      <w:r>
+        <w:t xml:space="preserve"> to protect a fragile bond. </w:t>
+      </w:r>
+      <w:r>
+        <w:rPr>
+          <w:i/>
+          <w:color w:val="555555"/>
+        </w:rPr>
+        <w:t>[Glen O. Gabbard, Long-Term Psychodynamic Psychotherapy: A Basic Text]</w:t>
       </w:r>
     </w:p>
     <w:p>
       <w:r>
         <w:rPr>
-          <w:i/>
-        </w:rPr>
-      </w:r>
-      <w:r>
-        <w:rPr>
-          <w:i/>
-        </w:rPr>
-        <w:t>The techniques chosen, how well they fit the client, how clearly they are explained, and how flexibly they are applied all feed back into the alliance, so method and relationship are tightly linked rather than separate.</w:t>
+          <w:b/>
+        </w:rPr>
+        <w:t xml:space="preserve">Mnemonic — SICK-TM: </w:t>
+      </w:r>
+      <w:r>
+        <w:t>Severity and chronicity, Insight and motivation, Comorbidity, Kind of disorder, Trauma history, risk and Medication/physical illness — the illness factors that shape the alliance.</w:t>
       </w:r>
     </w:p>
     <w:p>
+      <w:pPr>
+        <w:pStyle w:val="Heading1"/>
+      </w:pPr>
+      <w:r>
+        <w:t>5. How technique and therapeutic approach influence the relationship</w:t>
+      </w:r>
+    </w:p>
+    <w:p>
+      <w:r>
+        <w:rPr>
+          <w:i/>
+        </w:rPr>
+      </w:r>
+      <w:r>
+        <w:rPr>
+          <w:i/>
+        </w:rPr>
+        <w:t>The techniques chosen, how well they fit the client, how clearly they are explained, and how flexibly they are applied all feed back into the alliance, so method and relationship are tightly linked rather than separate.</w:t>
+      </w:r>
+    </w:p>
+    <w:p>
       <w:r>
         <w:rPr>
           <w:b/>
@@ -3494,6 +3584,96 @@
           <w:color w:val="555555"/>
         </w:rPr>
         <w:t>[Raymond J. Corsini &amp; Danny Wedding, Current Psychotherapies]</w:t>
+      </w:r>
+    </w:p>
+    <w:p>
+      <w:pPr>
+        <w:pStyle w:val="ListBullet"/>
+      </w:pPr>
+      <w:r>
+        <w:t xml:space="preserve">In CBT, </w:t>
+      </w:r>
+      <w:r>
+        <w:t xml:space="preserve">collaborative empiricism </w:t>
+      </w:r>
+      <w:r>
+        <w:rPr>
+          <w:i/>
+        </w:rPr>
+        <w:t>(client and therapist testing beliefs together like co-investigators)</w:t>
+      </w:r>
+      <w:r>
+        <w:t xml:space="preserve"> is itself a </w:t>
+      </w:r>
+      <w:r>
+        <w:rPr>
+          <w:b/>
+        </w:rPr>
+        <w:t>relationship stance</w:t>
+      </w:r>
+      <w:r>
+        <w:t xml:space="preserve">, because sharing the enquiry treats the client as a </w:t>
+      </w:r>
+      <w:r>
+        <w:rPr>
+          <w:b/>
+        </w:rPr>
+        <w:t>partner</w:t>
+      </w:r>
+      <w:r>
+        <w:t xml:space="preserve"> rather than a passive recipient. </w:t>
+      </w:r>
+      <w:r>
+        <w:rPr>
+          <w:i/>
+          <w:color w:val="555555"/>
+        </w:rPr>
+        <w:t>[Judith S. Beck, Cognitive Behavior Therapy: Basics and Beyond]</w:t>
+      </w:r>
+    </w:p>
+    <w:p>
+      <w:pPr>
+        <w:pStyle w:val="ListBullet"/>
+      </w:pPr>
+      <w:r>
+        <w:t xml:space="preserve">Using </w:t>
+      </w:r>
+      <w:r>
+        <w:t xml:space="preserve">Socratic questioning </w:t>
+      </w:r>
+      <w:r>
+        <w:rPr>
+          <w:i/>
+        </w:rPr>
+        <w:t>(guiding the client with questions to reach their own insight)</w:t>
+      </w:r>
+      <w:r>
+        <w:t xml:space="preserve"> rather than </w:t>
+      </w:r>
+      <w:r>
+        <w:rPr>
+          <w:b/>
+        </w:rPr>
+        <w:t>lecturing</w:t>
+      </w:r>
+      <w:r>
+        <w:t xml:space="preserve"> protects the bond, since discovered conclusions feel </w:t>
+      </w:r>
+      <w:r>
+        <w:rPr>
+          <w:b/>
+        </w:rPr>
+        <w:t>owned</w:t>
+      </w:r>
+      <w:r>
+        <w:t xml:space="preserve"> and respected instead of imposed. </w:t>
+      </w:r>
+      <w:r>
+        <w:rPr>
+          <w:i/>
+          <w:color w:val="555555"/>
+        </w:rPr>
+        <w:t>[Judith S. Beck, Cognitive Behavior Therapy: Basics and Beyond]</w:t>
       </w:r>
     </w:p>
     <w:p>
@@ -4796,6 +4976,51 @@
       </w:r>
       <w:r>
         <w:t xml:space="preserve">, so therapists are urged to invite honest feedback rather than assume a high score settles the matter. </w:t>
+      </w:r>
+      <w:r>
+        <w:rPr>
+          <w:i/>
+          <w:color w:val="555555"/>
+        </w:rPr>
+        <w:t>[Raymond J. Corsini &amp; Danny Wedding, Current Psychotherapies]</w:t>
+      </w:r>
+    </w:p>
+    <w:p>
+      <w:pPr>
+        <w:pStyle w:val="ListBullet"/>
+      </w:pPr>
+      <w:r>
+        <w:t xml:space="preserve">Building this in, </w:t>
+      </w:r>
+      <w:r>
+        <w:t xml:space="preserve">measurement-based care </w:t>
+      </w:r>
+      <w:r>
+        <w:rPr>
+          <w:i/>
+        </w:rPr>
+        <w:t>(formally using scores at each session to steer treatment)</w:t>
+      </w:r>
+      <w:r>
+        <w:t xml:space="preserve"> turns alliance feedback into </w:t>
+      </w:r>
+      <w:r>
+        <w:rPr>
+          <w:b/>
+        </w:rPr>
+        <w:t>routine clinical data</w:t>
+      </w:r>
+      <w:r>
+        <w:t xml:space="preserve">, so a dipping bond </w:t>
+      </w:r>
+      <w:r>
+        <w:rPr>
+          <w:b/>
+        </w:rPr>
+        <w:t>alters decisions</w:t>
+      </w:r>
+      <w:r>
+        <w:t xml:space="preserve"> early rather than surfacing only at a failed ending. </w:t>
       </w:r>
       <w:r>
         <w:rPr>

</xml_diff>